<commit_message>
MAJ 090926 3 cvs PDF
</commit_message>
<xml_diff>
--- a/assets/cv/Word/cv_darryll_joseph_data_analyst.docx
+++ b/assets/cv/Word/cv_darryll_joseph_data_analyst.docx
@@ -46,7 +46,43 @@
                 <w:color w:val="1A1A1A"/>
                 <w:sz w:val="24"/>
               </w:rPr>
-              <w:t>DATA ANALYST - Disponibilité Décembre 2026</w:t>
+              <w:t xml:space="preserve">DATA ANALYST - </w:t>
+            </w:r>
+            <w:proofErr w:type="spellStart"/>
+            <w:r>
+              <w:rPr>
+                <w:b/>
+                <w:color w:val="1A1A1A"/>
+                <w:sz w:val="24"/>
+              </w:rPr>
+              <w:t>Disponibilité</w:t>
+            </w:r>
+            <w:proofErr w:type="spellEnd"/>
+            <w:r>
+              <w:rPr>
+                <w:b/>
+                <w:color w:val="1A1A1A"/>
+                <w:sz w:val="24"/>
+              </w:rPr>
+              <w:t xml:space="preserve"> </w:t>
+            </w:r>
+            <w:proofErr w:type="spellStart"/>
+            <w:r>
+              <w:rPr>
+                <w:b/>
+                <w:color w:val="1A1A1A"/>
+                <w:sz w:val="24"/>
+              </w:rPr>
+              <w:t>Décembre</w:t>
+            </w:r>
+            <w:proofErr w:type="spellEnd"/>
+            <w:r>
+              <w:rPr>
+                <w:b/>
+                <w:color w:val="1A1A1A"/>
+                <w:sz w:val="24"/>
+              </w:rPr>
+              <w:t xml:space="preserve"> 2026</w:t>
             </w:r>
           </w:p>
           <w:p>
@@ -57,8 +93,88 @@
               <w:rPr>
                 <w:color w:val="333333"/>
               </w:rPr>
-              <w:t>07 58 83 92 14 • jos.darryll@gmail.com • Avenue Carnot, 94230 Cachan • LinkedIn • Portfolio</w:t>
+              <w:t>07 58 83 92 14</w:t>
             </w:r>
+            <w:r>
+              <w:rPr>
+                <w:color w:val="333333"/>
+              </w:rPr>
+              <w:t xml:space="preserve">    </w:t>
+            </w:r>
+            <w:r>
+              <w:rPr>
+                <w:color w:val="333333"/>
+              </w:rPr>
+              <w:t xml:space="preserve">• </w:t>
+            </w:r>
+            <w:hyperlink r:id="rId6" w:history="1">
+              <w:r>
+                <w:rPr>
+                  <w:rStyle w:val="Lienhypertexte"/>
+                </w:rPr>
+                <w:t>jos.darryll@gmail.com</w:t>
+              </w:r>
+            </w:hyperlink>
+            <w:r>
+              <w:rPr>
+                <w:color w:val="333333"/>
+              </w:rPr>
+              <w:t xml:space="preserve">   </w:t>
+            </w:r>
+            <w:r>
+              <w:rPr>
+                <w:color w:val="333333"/>
+              </w:rPr>
+              <w:t xml:space="preserve"> • Avenue Carnot, 94230 </w:t>
+            </w:r>
+            <w:proofErr w:type="spellStart"/>
+            <w:r>
+              <w:rPr>
+                <w:color w:val="333333"/>
+              </w:rPr>
+              <w:t>Cachan</w:t>
+            </w:r>
+            <w:proofErr w:type="spellEnd"/>
+            <w:r>
+              <w:rPr>
+                <w:color w:val="333333"/>
+              </w:rPr>
+              <w:t xml:space="preserve">    </w:t>
+            </w:r>
+            <w:r>
+              <w:rPr>
+                <w:color w:val="333333"/>
+              </w:rPr>
+              <w:t xml:space="preserve"> • </w:t>
+            </w:r>
+            <w:hyperlink r:id="rId7" w:history="1">
+              <w:r>
+                <w:rPr>
+                  <w:rStyle w:val="Lienhypertexte"/>
+                </w:rPr>
+                <w:t>LinkedIn</w:t>
+              </w:r>
+            </w:hyperlink>
+            <w:r>
+              <w:rPr>
+                <w:color w:val="333333"/>
+              </w:rPr>
+              <w:t xml:space="preserve">   </w:t>
+            </w:r>
+            <w:r>
+              <w:rPr>
+                <w:color w:val="333333"/>
+              </w:rPr>
+              <w:t xml:space="preserve"> • </w:t>
+            </w:r>
+            <w:hyperlink r:id="rId8" w:history="1">
+              <w:r>
+                <w:rPr>
+                  <w:rStyle w:val="Lienhypertexte"/>
+                </w:rPr>
+                <w:t>Portfolio</w:t>
+              </w:r>
+            </w:hyperlink>
           </w:p>
         </w:tc>
         <w:tc>
@@ -111,7 +227,7 @@
                     <pic:cNvPicPr/>
                   </pic:nvPicPr>
                   <pic:blipFill>
-                    <a:blip r:embed="rId6"/>
+                    <a:blip r:embed="rId9"/>
                     <a:stretch>
                       <a:fillRect/>
                     </a:stretch>
@@ -185,17 +301,104 @@
       <w:pPr>
         <w:spacing w:after="60" w:line="240" w:lineRule="auto"/>
         <w:rPr>
-          <w:sz w:val="18"/>
-          <w:szCs w:val="18"/>
-        </w:rPr>
-      </w:pPr>
-      <w:r>
-        <w:rPr>
-          <w:color w:val="1A1A1A"/>
-          <w:sz w:val="18"/>
-          <w:szCs w:val="18"/>
-        </w:rPr>
-        <w:t>Data Analyst diplômé d'un Bac+5 en Data Engineering &amp; Intelligence Artificielle, avec plus de 3 ans d'expérience dans l'analyse et la valorisation des données. J'accompagne les métiers dans la prise de décision grâce à la conception de tableaux de bord, la modélisation des données et l'analyse de KPI. Certifié Microsoft Power BI (PL-300), je maîtrise l'ensemble de la chaîne décisionnelle, de la préparation des données à la restitution d'indicateurs stratégiques.</w:t>
+          <w:color w:val="1A1A1A"/>
+          <w:sz w:val="18"/>
+          <w:szCs w:val="18"/>
+          <w:lang w:val="fr-FR"/>
+        </w:rPr>
+      </w:pPr>
+      <w:r>
+        <w:rPr>
+          <w:b/>
+          <w:bCs/>
+          <w:color w:val="1A1A1A"/>
+          <w:sz w:val="18"/>
+          <w:szCs w:val="18"/>
+          <w:lang w:val="fr-FR"/>
+        </w:rPr>
+        <w:t xml:space="preserve">Data </w:t>
+      </w:r>
+      <w:proofErr w:type="spellStart"/>
+      <w:r>
+        <w:rPr>
+          <w:b/>
+          <w:bCs/>
+          <w:color w:val="1A1A1A"/>
+          <w:sz w:val="18"/>
+          <w:szCs w:val="18"/>
+          <w:lang w:val="fr-FR"/>
+        </w:rPr>
+        <w:t>Analyst</w:t>
+      </w:r>
+      <w:proofErr w:type="spellEnd"/>
+      <w:r>
+        <w:rPr>
+          <w:color w:val="1A1A1A"/>
+          <w:sz w:val="18"/>
+          <w:szCs w:val="18"/>
+          <w:lang w:val="fr-FR"/>
+        </w:rPr>
+        <w:t xml:space="preserve"> diplômé d’un Bac+5 en Data Engineering &amp; Intelligence Artificielle, avec plus de 3 ans d’expérience dans l’analyse et la valorisation des données. J’aime transformer les données en </w:t>
+      </w:r>
+      <w:r>
+        <w:rPr>
+          <w:b/>
+          <w:bCs/>
+          <w:color w:val="1A1A1A"/>
+          <w:sz w:val="18"/>
+          <w:szCs w:val="18"/>
+          <w:lang w:val="fr-FR"/>
+        </w:rPr>
+        <w:t>insights clairs et utiles à la décision</w:t>
+      </w:r>
+      <w:r>
+        <w:rPr>
+          <w:color w:val="1A1A1A"/>
+          <w:sz w:val="18"/>
+          <w:szCs w:val="18"/>
+          <w:lang w:val="fr-FR"/>
+        </w:rPr>
+        <w:t xml:space="preserve">, à travers la BI, la modélisation et le suivi des KPI. Certifié </w:t>
+      </w:r>
+      <w:r>
+        <w:rPr>
+          <w:b/>
+          <w:bCs/>
+          <w:color w:val="1A1A1A"/>
+          <w:sz w:val="18"/>
+          <w:szCs w:val="18"/>
+          <w:lang w:val="fr-FR"/>
+        </w:rPr>
+        <w:t>Microsoft Power BI (PL-300)</w:t>
+      </w:r>
+      <w:r>
+        <w:rPr>
+          <w:color w:val="1A1A1A"/>
+          <w:sz w:val="18"/>
+          <w:szCs w:val="18"/>
+          <w:lang w:val="fr-FR"/>
+        </w:rPr>
+        <w:t xml:space="preserve">, je suis curieux, structuré et à l’écoute des besoins métiers. </w:t>
+      </w:r>
+      <w:r>
+        <w:rPr>
+          <w:b/>
+          <w:bCs/>
+          <w:color w:val="1A1A1A"/>
+          <w:sz w:val="18"/>
+          <w:szCs w:val="18"/>
+          <w:lang w:val="fr-FR"/>
+        </w:rPr>
+        <w:t>À la recherche d’un CDI</w:t>
+      </w:r>
+      <w:r>
+        <w:rPr>
+          <w:color w:val="1A1A1A"/>
+          <w:sz w:val="18"/>
+          <w:szCs w:val="18"/>
+          <w:lang w:val="fr-FR"/>
+        </w:rPr>
+        <w:t xml:space="preserve"> dans lequel mettre mes compétences au service de projets Data à forte valeur ajoutée.</w:t>
       </w:r>
     </w:p>
     <w:p>
@@ -245,8 +448,19 @@
           <w:szCs w:val="18"/>
         </w:rPr>
         <w:tab/>
-        <w:t>09/2025 - Aujourd'hui</w:t>
-      </w:r>
+        <w:t xml:space="preserve">09/2025 - </w:t>
+      </w:r>
+      <w:proofErr w:type="spellStart"/>
+      <w:r>
+        <w:rPr>
+          <w:b/>
+          <w:color w:val="1A1A1A"/>
+          <w:sz w:val="18"/>
+          <w:szCs w:val="18"/>
+        </w:rPr>
+        <w:t>Aujourd'hui</w:t>
+      </w:r>
+      <w:proofErr w:type="spellEnd"/>
     </w:p>
     <w:p>
       <w:pPr>
@@ -285,7 +499,25 @@
           <w:sz w:val="18"/>
           <w:szCs w:val="18"/>
         </w:rPr>
-        <w:t>Conception et structuration de modèles de données au sein du Master Data Management (MDM).</w:t>
+        <w:t xml:space="preserve">Conception et structuration de </w:t>
+      </w:r>
+      <w:proofErr w:type="spellStart"/>
+      <w:r>
+        <w:rPr>
+          <w:color w:val="1A1A1A"/>
+          <w:sz w:val="18"/>
+          <w:szCs w:val="18"/>
+        </w:rPr>
+        <w:t>modèles</w:t>
+      </w:r>
+      <w:proofErr w:type="spellEnd"/>
+      <w:r>
+        <w:rPr>
+          <w:color w:val="1A1A1A"/>
+          <w:sz w:val="18"/>
+          <w:szCs w:val="18"/>
+        </w:rPr>
+        <w:t xml:space="preserve"> de données au sein du Master Data Management (MDM).</w:t>
       </w:r>
     </w:p>
     <w:p>
@@ -323,7 +555,43 @@
           <w:sz w:val="18"/>
           <w:szCs w:val="18"/>
         </w:rPr>
-        <w:t xml:space="preserve"> extraction, transformation, validation et contrôle qualité.</w:t>
+        <w:t xml:space="preserve"> extraction, transformation, validation et </w:t>
+      </w:r>
+      <w:proofErr w:type="spellStart"/>
+      <w:r>
+        <w:rPr>
+          <w:color w:val="1A1A1A"/>
+          <w:sz w:val="18"/>
+          <w:szCs w:val="18"/>
+        </w:rPr>
+        <w:t>contrôle</w:t>
+      </w:r>
+      <w:proofErr w:type="spellEnd"/>
+      <w:r>
+        <w:rPr>
+          <w:color w:val="1A1A1A"/>
+          <w:sz w:val="18"/>
+          <w:szCs w:val="18"/>
+        </w:rPr>
+        <w:t xml:space="preserve"> </w:t>
+      </w:r>
+      <w:proofErr w:type="spellStart"/>
+      <w:r>
+        <w:rPr>
+          <w:color w:val="1A1A1A"/>
+          <w:sz w:val="18"/>
+          <w:szCs w:val="18"/>
+        </w:rPr>
+        <w:t>qualité</w:t>
+      </w:r>
+      <w:proofErr w:type="spellEnd"/>
+      <w:r>
+        <w:rPr>
+          <w:color w:val="1A1A1A"/>
+          <w:sz w:val="18"/>
+          <w:szCs w:val="18"/>
+        </w:rPr>
+        <w:t>.</w:t>
       </w:r>
     </w:p>
     <w:p>
@@ -355,7 +623,79 @@
           <w:sz w:val="18"/>
           <w:szCs w:val="18"/>
         </w:rPr>
-        <w:t xml:space="preserve"> de tableaux de bord et de rapports avec Power BI pour le suivi des indicateurs et l'aide à la décision.</w:t>
+        <w:t xml:space="preserve"> de tableaux de bord et de rapports avec Power BI pour le </w:t>
+      </w:r>
+      <w:proofErr w:type="spellStart"/>
+      <w:r>
+        <w:rPr>
+          <w:color w:val="1A1A1A"/>
+          <w:sz w:val="18"/>
+          <w:szCs w:val="18"/>
+        </w:rPr>
+        <w:t>suivi</w:t>
+      </w:r>
+      <w:proofErr w:type="spellEnd"/>
+      <w:r>
+        <w:rPr>
+          <w:color w:val="1A1A1A"/>
+          <w:sz w:val="18"/>
+          <w:szCs w:val="18"/>
+        </w:rPr>
+        <w:t xml:space="preserve"> des </w:t>
+      </w:r>
+      <w:proofErr w:type="spellStart"/>
+      <w:r>
+        <w:rPr>
+          <w:color w:val="1A1A1A"/>
+          <w:sz w:val="18"/>
+          <w:szCs w:val="18"/>
+        </w:rPr>
+        <w:t>indicateurs</w:t>
+      </w:r>
+      <w:proofErr w:type="spellEnd"/>
+      <w:r>
+        <w:rPr>
+          <w:color w:val="1A1A1A"/>
+          <w:sz w:val="18"/>
+          <w:szCs w:val="18"/>
+        </w:rPr>
+        <w:t xml:space="preserve"> et </w:t>
+      </w:r>
+      <w:proofErr w:type="spellStart"/>
+      <w:r>
+        <w:rPr>
+          <w:color w:val="1A1A1A"/>
+          <w:sz w:val="18"/>
+          <w:szCs w:val="18"/>
+        </w:rPr>
+        <w:t>l'aide</w:t>
+      </w:r>
+      <w:proofErr w:type="spellEnd"/>
+      <w:r>
+        <w:rPr>
+          <w:color w:val="1A1A1A"/>
+          <w:sz w:val="18"/>
+          <w:szCs w:val="18"/>
+        </w:rPr>
+        <w:t xml:space="preserve"> à la </w:t>
+      </w:r>
+      <w:proofErr w:type="spellStart"/>
+      <w:r>
+        <w:rPr>
+          <w:color w:val="1A1A1A"/>
+          <w:sz w:val="18"/>
+          <w:szCs w:val="18"/>
+        </w:rPr>
+        <w:t>décision</w:t>
+      </w:r>
+      <w:proofErr w:type="spellEnd"/>
+      <w:r>
+        <w:rPr>
+          <w:color w:val="1A1A1A"/>
+          <w:sz w:val="18"/>
+          <w:szCs w:val="18"/>
+        </w:rPr>
+        <w:t>.</w:t>
       </w:r>
     </w:p>
     <w:p>
@@ -387,7 +727,61 @@
           <w:sz w:val="18"/>
           <w:szCs w:val="18"/>
         </w:rPr>
-        <w:t xml:space="preserve"> des données et accompagnement des équipes métiers dans l'interprétation des résultats.</w:t>
+        <w:t xml:space="preserve"> des données et </w:t>
+      </w:r>
+      <w:proofErr w:type="spellStart"/>
+      <w:r>
+        <w:rPr>
+          <w:color w:val="1A1A1A"/>
+          <w:sz w:val="18"/>
+          <w:szCs w:val="18"/>
+        </w:rPr>
+        <w:t>accompagnement</w:t>
+      </w:r>
+      <w:proofErr w:type="spellEnd"/>
+      <w:r>
+        <w:rPr>
+          <w:color w:val="1A1A1A"/>
+          <w:sz w:val="18"/>
+          <w:szCs w:val="18"/>
+        </w:rPr>
+        <w:t xml:space="preserve"> des équipes métiers dans </w:t>
+      </w:r>
+      <w:proofErr w:type="spellStart"/>
+      <w:r>
+        <w:rPr>
+          <w:color w:val="1A1A1A"/>
+          <w:sz w:val="18"/>
+          <w:szCs w:val="18"/>
+        </w:rPr>
+        <w:t>l'interprétation</w:t>
+      </w:r>
+      <w:proofErr w:type="spellEnd"/>
+      <w:r>
+        <w:rPr>
+          <w:color w:val="1A1A1A"/>
+          <w:sz w:val="18"/>
+          <w:szCs w:val="18"/>
+        </w:rPr>
+        <w:t xml:space="preserve"> des </w:t>
+      </w:r>
+      <w:proofErr w:type="spellStart"/>
+      <w:r>
+        <w:rPr>
+          <w:color w:val="1A1A1A"/>
+          <w:sz w:val="18"/>
+          <w:szCs w:val="18"/>
+        </w:rPr>
+        <w:t>résultats</w:t>
+      </w:r>
+      <w:proofErr w:type="spellEnd"/>
+      <w:r>
+        <w:rPr>
+          <w:color w:val="1A1A1A"/>
+          <w:sz w:val="18"/>
+          <w:szCs w:val="18"/>
+        </w:rPr>
+        <w:t>.</w:t>
       </w:r>
     </w:p>
     <w:p>
@@ -427,7 +821,97 @@
           <w:sz w:val="18"/>
           <w:szCs w:val="18"/>
         </w:rPr>
-        <w:t xml:space="preserve"> de KPI, en contribuant à l'amélioration de la gouvernance et de la qualité des données.</w:t>
+        <w:t xml:space="preserve"> de KPI, </w:t>
+      </w:r>
+      <w:proofErr w:type="spellStart"/>
+      <w:r>
+        <w:rPr>
+          <w:color w:val="1A1A1A"/>
+          <w:sz w:val="18"/>
+          <w:szCs w:val="18"/>
+        </w:rPr>
+        <w:t>en</w:t>
+      </w:r>
+      <w:proofErr w:type="spellEnd"/>
+      <w:r>
+        <w:rPr>
+          <w:color w:val="1A1A1A"/>
+          <w:sz w:val="18"/>
+          <w:szCs w:val="18"/>
+        </w:rPr>
+        <w:t xml:space="preserve"> </w:t>
+      </w:r>
+      <w:proofErr w:type="spellStart"/>
+      <w:r>
+        <w:rPr>
+          <w:color w:val="1A1A1A"/>
+          <w:sz w:val="18"/>
+          <w:szCs w:val="18"/>
+        </w:rPr>
+        <w:t>contribuant</w:t>
+      </w:r>
+      <w:proofErr w:type="spellEnd"/>
+      <w:r>
+        <w:rPr>
+          <w:color w:val="1A1A1A"/>
+          <w:sz w:val="18"/>
+          <w:szCs w:val="18"/>
+        </w:rPr>
+        <w:t xml:space="preserve"> à </w:t>
+      </w:r>
+      <w:proofErr w:type="spellStart"/>
+      <w:r>
+        <w:rPr>
+          <w:color w:val="1A1A1A"/>
+          <w:sz w:val="18"/>
+          <w:szCs w:val="18"/>
+        </w:rPr>
+        <w:t>l'amélioration</w:t>
+      </w:r>
+      <w:proofErr w:type="spellEnd"/>
+      <w:r>
+        <w:rPr>
+          <w:color w:val="1A1A1A"/>
+          <w:sz w:val="18"/>
+          <w:szCs w:val="18"/>
+        </w:rPr>
+        <w:t xml:space="preserve"> de la </w:t>
+      </w:r>
+      <w:proofErr w:type="spellStart"/>
+      <w:r>
+        <w:rPr>
+          <w:color w:val="1A1A1A"/>
+          <w:sz w:val="18"/>
+          <w:szCs w:val="18"/>
+        </w:rPr>
+        <w:t>gouvernance</w:t>
+      </w:r>
+      <w:proofErr w:type="spellEnd"/>
+      <w:r>
+        <w:rPr>
+          <w:color w:val="1A1A1A"/>
+          <w:sz w:val="18"/>
+          <w:szCs w:val="18"/>
+        </w:rPr>
+        <w:t xml:space="preserve"> et de la </w:t>
+      </w:r>
+      <w:proofErr w:type="spellStart"/>
+      <w:r>
+        <w:rPr>
+          <w:color w:val="1A1A1A"/>
+          <w:sz w:val="18"/>
+          <w:szCs w:val="18"/>
+        </w:rPr>
+        <w:t>qualité</w:t>
+      </w:r>
+      <w:proofErr w:type="spellEnd"/>
+      <w:r>
+        <w:rPr>
+          <w:color w:val="1A1A1A"/>
+          <w:sz w:val="18"/>
+          <w:szCs w:val="18"/>
+        </w:rPr>
+        <w:t xml:space="preserve"> des données.</w:t>
       </w:r>
     </w:p>
     <w:p>
@@ -448,7 +932,27 @@
           <w:sz w:val="18"/>
           <w:szCs w:val="18"/>
         </w:rPr>
-        <w:t>Data Analyst / Développeur BI</w:t>
+        <w:t xml:space="preserve">Data Analyst / </w:t>
+      </w:r>
+      <w:proofErr w:type="spellStart"/>
+      <w:r>
+        <w:rPr>
+          <w:b/>
+          <w:color w:val="1A1A1A"/>
+          <w:sz w:val="18"/>
+          <w:szCs w:val="18"/>
+        </w:rPr>
+        <w:t>Développeur</w:t>
+      </w:r>
+      <w:proofErr w:type="spellEnd"/>
+      <w:r>
+        <w:rPr>
+          <w:b/>
+          <w:color w:val="1A1A1A"/>
+          <w:sz w:val="18"/>
+          <w:szCs w:val="18"/>
+        </w:rPr>
+        <w:t xml:space="preserve"> BI</w:t>
       </w:r>
       <w:r>
         <w:rPr>
@@ -494,7 +998,25 @@
           <w:sz w:val="18"/>
           <w:szCs w:val="18"/>
         </w:rPr>
-        <w:t>•  Développement de 15+ tableaux de bord Power BI pour le suivi des KPI métier.</w:t>
+        <w:t xml:space="preserve">•  Développement de 15+ tableaux de bord Power BI pour le </w:t>
+      </w:r>
+      <w:proofErr w:type="spellStart"/>
+      <w:r>
+        <w:rPr>
+          <w:color w:val="1A1A1A"/>
+          <w:sz w:val="18"/>
+          <w:szCs w:val="18"/>
+        </w:rPr>
+        <w:t>suivi</w:t>
+      </w:r>
+      <w:proofErr w:type="spellEnd"/>
+      <w:r>
+        <w:rPr>
+          <w:color w:val="1A1A1A"/>
+          <w:sz w:val="18"/>
+          <w:szCs w:val="18"/>
+        </w:rPr>
+        <w:t xml:space="preserve"> des KPI métier.</w:t>
       </w:r>
     </w:p>
     <w:p>
@@ -512,7 +1034,79 @@
           <w:sz w:val="18"/>
           <w:szCs w:val="18"/>
         </w:rPr>
-        <w:t>•  Conception de modèles sémantiques et de cubes OLAP pour l'analyse multidimensionnelle.</w:t>
+        <w:t xml:space="preserve">•  Conception de </w:t>
+      </w:r>
+      <w:proofErr w:type="spellStart"/>
+      <w:r>
+        <w:rPr>
+          <w:color w:val="1A1A1A"/>
+          <w:sz w:val="18"/>
+          <w:szCs w:val="18"/>
+        </w:rPr>
+        <w:t>modèles</w:t>
+      </w:r>
+      <w:proofErr w:type="spellEnd"/>
+      <w:r>
+        <w:rPr>
+          <w:color w:val="1A1A1A"/>
+          <w:sz w:val="18"/>
+          <w:szCs w:val="18"/>
+        </w:rPr>
+        <w:t xml:space="preserve"> </w:t>
+      </w:r>
+      <w:proofErr w:type="spellStart"/>
+      <w:r>
+        <w:rPr>
+          <w:color w:val="1A1A1A"/>
+          <w:sz w:val="18"/>
+          <w:szCs w:val="18"/>
+        </w:rPr>
+        <w:t>sémantiques</w:t>
+      </w:r>
+      <w:proofErr w:type="spellEnd"/>
+      <w:r>
+        <w:rPr>
+          <w:color w:val="1A1A1A"/>
+          <w:sz w:val="18"/>
+          <w:szCs w:val="18"/>
+        </w:rPr>
+        <w:t xml:space="preserve"> et de cubes OLAP pour </w:t>
+      </w:r>
+      <w:proofErr w:type="spellStart"/>
+      <w:r>
+        <w:rPr>
+          <w:color w:val="1A1A1A"/>
+          <w:sz w:val="18"/>
+          <w:szCs w:val="18"/>
+        </w:rPr>
+        <w:t>l'analyse</w:t>
+      </w:r>
+      <w:proofErr w:type="spellEnd"/>
+      <w:r>
+        <w:rPr>
+          <w:color w:val="1A1A1A"/>
+          <w:sz w:val="18"/>
+          <w:szCs w:val="18"/>
+        </w:rPr>
+        <w:t xml:space="preserve"> </w:t>
+      </w:r>
+      <w:proofErr w:type="spellStart"/>
+      <w:r>
+        <w:rPr>
+          <w:color w:val="1A1A1A"/>
+          <w:sz w:val="18"/>
+          <w:szCs w:val="18"/>
+        </w:rPr>
+        <w:t>multidimensionnelle</w:t>
+      </w:r>
+      <w:proofErr w:type="spellEnd"/>
+      <w:r>
+        <w:rPr>
+          <w:color w:val="1A1A1A"/>
+          <w:sz w:val="18"/>
+          <w:szCs w:val="18"/>
+        </w:rPr>
+        <w:t>.</w:t>
       </w:r>
     </w:p>
     <w:p>
@@ -548,7 +1142,79 @@
           <w:sz w:val="18"/>
           <w:szCs w:val="18"/>
         </w:rPr>
-        <w:t>•  Intégration de données multi-sources et contrôle de leur qualité.</w:t>
+        <w:t xml:space="preserve">•  </w:t>
+      </w:r>
+      <w:proofErr w:type="spellStart"/>
+      <w:r>
+        <w:rPr>
+          <w:color w:val="1A1A1A"/>
+          <w:sz w:val="18"/>
+          <w:szCs w:val="18"/>
+        </w:rPr>
+        <w:t>Intégration</w:t>
+      </w:r>
+      <w:proofErr w:type="spellEnd"/>
+      <w:r>
+        <w:rPr>
+          <w:color w:val="1A1A1A"/>
+          <w:sz w:val="18"/>
+          <w:szCs w:val="18"/>
+        </w:rPr>
+        <w:t xml:space="preserve"> de données multi-sources et </w:t>
+      </w:r>
+      <w:proofErr w:type="spellStart"/>
+      <w:r>
+        <w:rPr>
+          <w:color w:val="1A1A1A"/>
+          <w:sz w:val="18"/>
+          <w:szCs w:val="18"/>
+        </w:rPr>
+        <w:t>contrôle</w:t>
+      </w:r>
+      <w:proofErr w:type="spellEnd"/>
+      <w:r>
+        <w:rPr>
+          <w:color w:val="1A1A1A"/>
+          <w:sz w:val="18"/>
+          <w:szCs w:val="18"/>
+        </w:rPr>
+        <w:t xml:space="preserve"> de </w:t>
+      </w:r>
+      <w:proofErr w:type="spellStart"/>
+      <w:r>
+        <w:rPr>
+          <w:color w:val="1A1A1A"/>
+          <w:sz w:val="18"/>
+          <w:szCs w:val="18"/>
+        </w:rPr>
+        <w:t>leur</w:t>
+      </w:r>
+      <w:proofErr w:type="spellEnd"/>
+      <w:r>
+        <w:rPr>
+          <w:color w:val="1A1A1A"/>
+          <w:sz w:val="18"/>
+          <w:szCs w:val="18"/>
+        </w:rPr>
+        <w:t xml:space="preserve"> </w:t>
+      </w:r>
+      <w:proofErr w:type="spellStart"/>
+      <w:r>
+        <w:rPr>
+          <w:color w:val="1A1A1A"/>
+          <w:sz w:val="18"/>
+          <w:szCs w:val="18"/>
+        </w:rPr>
+        <w:t>qualité</w:t>
+      </w:r>
+      <w:proofErr w:type="spellEnd"/>
+      <w:r>
+        <w:rPr>
+          <w:color w:val="1A1A1A"/>
+          <w:sz w:val="18"/>
+          <w:szCs w:val="18"/>
+        </w:rPr>
+        <w:t>.</w:t>
       </w:r>
     </w:p>
     <w:p>
@@ -566,7 +1232,61 @@
           <w:sz w:val="18"/>
           <w:szCs w:val="18"/>
         </w:rPr>
-        <w:t>•  Collaboration avec les équipes métiers pour formaliser les besoins décisionnels.</w:t>
+        <w:t xml:space="preserve">•  Collaboration avec les équipes métiers pour </w:t>
+      </w:r>
+      <w:proofErr w:type="spellStart"/>
+      <w:r>
+        <w:rPr>
+          <w:color w:val="1A1A1A"/>
+          <w:sz w:val="18"/>
+          <w:szCs w:val="18"/>
+        </w:rPr>
+        <w:t>formaliser</w:t>
+      </w:r>
+      <w:proofErr w:type="spellEnd"/>
+      <w:r>
+        <w:rPr>
+          <w:color w:val="1A1A1A"/>
+          <w:sz w:val="18"/>
+          <w:szCs w:val="18"/>
+        </w:rPr>
+        <w:t xml:space="preserve"> les </w:t>
+      </w:r>
+      <w:proofErr w:type="spellStart"/>
+      <w:r>
+        <w:rPr>
+          <w:color w:val="1A1A1A"/>
+          <w:sz w:val="18"/>
+          <w:szCs w:val="18"/>
+        </w:rPr>
+        <w:t>besoins</w:t>
+      </w:r>
+      <w:proofErr w:type="spellEnd"/>
+      <w:r>
+        <w:rPr>
+          <w:color w:val="1A1A1A"/>
+          <w:sz w:val="18"/>
+          <w:szCs w:val="18"/>
+        </w:rPr>
+        <w:t xml:space="preserve"> </w:t>
+      </w:r>
+      <w:proofErr w:type="spellStart"/>
+      <w:r>
+        <w:rPr>
+          <w:color w:val="1A1A1A"/>
+          <w:sz w:val="18"/>
+          <w:szCs w:val="18"/>
+        </w:rPr>
+        <w:t>décisionnels</w:t>
+      </w:r>
+      <w:proofErr w:type="spellEnd"/>
+      <w:r>
+        <w:rPr>
+          <w:color w:val="1A1A1A"/>
+          <w:sz w:val="18"/>
+          <w:szCs w:val="18"/>
+        </w:rPr>
+        <w:t>.</w:t>
       </w:r>
     </w:p>
     <w:p>
@@ -580,6 +1300,7 @@
           <w:szCs w:val="18"/>
         </w:rPr>
       </w:pPr>
+      <w:proofErr w:type="spellStart"/>
       <w:r>
         <w:rPr>
           <w:b/>
@@ -587,7 +1308,17 @@
           <w:sz w:val="18"/>
           <w:szCs w:val="18"/>
         </w:rPr>
-        <w:t>Développeur CRM Microsoft Dynamics 365 (Stage)</w:t>
+        <w:t>Développeur</w:t>
+      </w:r>
+      <w:proofErr w:type="spellEnd"/>
+      <w:r>
+        <w:rPr>
+          <w:b/>
+          <w:color w:val="1A1A1A"/>
+          <w:sz w:val="18"/>
+          <w:szCs w:val="18"/>
+        </w:rPr>
+        <w:t xml:space="preserve"> CRM Microsoft Dynamics 365 (Stage)</w:t>
       </w:r>
       <w:r>
         <w:rPr>
@@ -633,7 +1364,97 @@
           <w:sz w:val="18"/>
           <w:szCs w:val="18"/>
         </w:rPr>
-        <w:t>•  Optimisation des bases de données relationnelles afin d'améliorer les performances des requêtes SQL.</w:t>
+        <w:t xml:space="preserve">•  </w:t>
+      </w:r>
+      <w:proofErr w:type="spellStart"/>
+      <w:r>
+        <w:rPr>
+          <w:color w:val="1A1A1A"/>
+          <w:sz w:val="18"/>
+          <w:szCs w:val="18"/>
+        </w:rPr>
+        <w:t>Optimisation</w:t>
+      </w:r>
+      <w:proofErr w:type="spellEnd"/>
+      <w:r>
+        <w:rPr>
+          <w:color w:val="1A1A1A"/>
+          <w:sz w:val="18"/>
+          <w:szCs w:val="18"/>
+        </w:rPr>
+        <w:t xml:space="preserve"> des bases de données </w:t>
+      </w:r>
+      <w:proofErr w:type="spellStart"/>
+      <w:r>
+        <w:rPr>
+          <w:color w:val="1A1A1A"/>
+          <w:sz w:val="18"/>
+          <w:szCs w:val="18"/>
+        </w:rPr>
+        <w:t>relationnelles</w:t>
+      </w:r>
+      <w:proofErr w:type="spellEnd"/>
+      <w:r>
+        <w:rPr>
+          <w:color w:val="1A1A1A"/>
+          <w:sz w:val="18"/>
+          <w:szCs w:val="18"/>
+        </w:rPr>
+        <w:t xml:space="preserve"> </w:t>
+      </w:r>
+      <w:proofErr w:type="spellStart"/>
+      <w:r>
+        <w:rPr>
+          <w:color w:val="1A1A1A"/>
+          <w:sz w:val="18"/>
+          <w:szCs w:val="18"/>
+        </w:rPr>
+        <w:t>afin</w:t>
+      </w:r>
+      <w:proofErr w:type="spellEnd"/>
+      <w:r>
+        <w:rPr>
+          <w:color w:val="1A1A1A"/>
+          <w:sz w:val="18"/>
+          <w:szCs w:val="18"/>
+        </w:rPr>
+        <w:t xml:space="preserve"> </w:t>
+      </w:r>
+      <w:proofErr w:type="spellStart"/>
+      <w:r>
+        <w:rPr>
+          <w:color w:val="1A1A1A"/>
+          <w:sz w:val="18"/>
+          <w:szCs w:val="18"/>
+        </w:rPr>
+        <w:t>d'améliorer</w:t>
+      </w:r>
+      <w:proofErr w:type="spellEnd"/>
+      <w:r>
+        <w:rPr>
+          <w:color w:val="1A1A1A"/>
+          <w:sz w:val="18"/>
+          <w:szCs w:val="18"/>
+        </w:rPr>
+        <w:t xml:space="preserve"> les performances des </w:t>
+      </w:r>
+      <w:proofErr w:type="spellStart"/>
+      <w:r>
+        <w:rPr>
+          <w:color w:val="1A1A1A"/>
+          <w:sz w:val="18"/>
+          <w:szCs w:val="18"/>
+        </w:rPr>
+        <w:t>requêtes</w:t>
+      </w:r>
+      <w:proofErr w:type="spellEnd"/>
+      <w:r>
+        <w:rPr>
+          <w:color w:val="1A1A1A"/>
+          <w:sz w:val="18"/>
+          <w:szCs w:val="18"/>
+        </w:rPr>
+        <w:t xml:space="preserve"> SQL.</w:t>
       </w:r>
     </w:p>
     <w:p>
@@ -651,7 +1472,61 @@
           <w:sz w:val="18"/>
           <w:szCs w:val="18"/>
         </w:rPr>
-        <w:t>•  Développement de Web Services en C# pour automatiser les échanges de données avec le CRM.</w:t>
+        <w:t xml:space="preserve">•  Développement de Web Services </w:t>
+      </w:r>
+      <w:proofErr w:type="spellStart"/>
+      <w:r>
+        <w:rPr>
+          <w:color w:val="1A1A1A"/>
+          <w:sz w:val="18"/>
+          <w:szCs w:val="18"/>
+        </w:rPr>
+        <w:t>en</w:t>
+      </w:r>
+      <w:proofErr w:type="spellEnd"/>
+      <w:r>
+        <w:rPr>
+          <w:color w:val="1A1A1A"/>
+          <w:sz w:val="18"/>
+          <w:szCs w:val="18"/>
+        </w:rPr>
+        <w:t xml:space="preserve"> C# pour </w:t>
+      </w:r>
+      <w:proofErr w:type="spellStart"/>
+      <w:r>
+        <w:rPr>
+          <w:color w:val="1A1A1A"/>
+          <w:sz w:val="18"/>
+          <w:szCs w:val="18"/>
+        </w:rPr>
+        <w:t>automatiser</w:t>
+      </w:r>
+      <w:proofErr w:type="spellEnd"/>
+      <w:r>
+        <w:rPr>
+          <w:color w:val="1A1A1A"/>
+          <w:sz w:val="18"/>
+          <w:szCs w:val="18"/>
+        </w:rPr>
+        <w:t xml:space="preserve"> les </w:t>
+      </w:r>
+      <w:proofErr w:type="spellStart"/>
+      <w:r>
+        <w:rPr>
+          <w:color w:val="1A1A1A"/>
+          <w:sz w:val="18"/>
+          <w:szCs w:val="18"/>
+        </w:rPr>
+        <w:t>échanges</w:t>
+      </w:r>
+      <w:proofErr w:type="spellEnd"/>
+      <w:r>
+        <w:rPr>
+          <w:color w:val="1A1A1A"/>
+          <w:sz w:val="18"/>
+          <w:szCs w:val="18"/>
+        </w:rPr>
+        <w:t xml:space="preserve"> de données avec le CRM.</w:t>
       </w:r>
     </w:p>
     <w:p>
@@ -669,7 +1544,97 @@
           <w:sz w:val="18"/>
           <w:szCs w:val="18"/>
         </w:rPr>
-        <w:t xml:space="preserve">•  Intégration et fiabilisation des données afin d'améliorer leur exploitation </w:t>
+        <w:t xml:space="preserve">•  </w:t>
+      </w:r>
+      <w:proofErr w:type="spellStart"/>
+      <w:r>
+        <w:rPr>
+          <w:color w:val="1A1A1A"/>
+          <w:sz w:val="18"/>
+          <w:szCs w:val="18"/>
+        </w:rPr>
+        <w:t>Intégration</w:t>
+      </w:r>
+      <w:proofErr w:type="spellEnd"/>
+      <w:r>
+        <w:rPr>
+          <w:color w:val="1A1A1A"/>
+          <w:sz w:val="18"/>
+          <w:szCs w:val="18"/>
+        </w:rPr>
+        <w:t xml:space="preserve"> et </w:t>
+      </w:r>
+      <w:proofErr w:type="spellStart"/>
+      <w:r>
+        <w:rPr>
+          <w:color w:val="1A1A1A"/>
+          <w:sz w:val="18"/>
+          <w:szCs w:val="18"/>
+        </w:rPr>
+        <w:t>fiabilisation</w:t>
+      </w:r>
+      <w:proofErr w:type="spellEnd"/>
+      <w:r>
+        <w:rPr>
+          <w:color w:val="1A1A1A"/>
+          <w:sz w:val="18"/>
+          <w:szCs w:val="18"/>
+        </w:rPr>
+        <w:t xml:space="preserve"> des données </w:t>
+      </w:r>
+      <w:proofErr w:type="spellStart"/>
+      <w:r>
+        <w:rPr>
+          <w:color w:val="1A1A1A"/>
+          <w:sz w:val="18"/>
+          <w:szCs w:val="18"/>
+        </w:rPr>
+        <w:t>afin</w:t>
+      </w:r>
+      <w:proofErr w:type="spellEnd"/>
+      <w:r>
+        <w:rPr>
+          <w:color w:val="1A1A1A"/>
+          <w:sz w:val="18"/>
+          <w:szCs w:val="18"/>
+        </w:rPr>
+        <w:t xml:space="preserve"> </w:t>
+      </w:r>
+      <w:proofErr w:type="spellStart"/>
+      <w:r>
+        <w:rPr>
+          <w:color w:val="1A1A1A"/>
+          <w:sz w:val="18"/>
+          <w:szCs w:val="18"/>
+        </w:rPr>
+        <w:t>d'améliorer</w:t>
+      </w:r>
+      <w:proofErr w:type="spellEnd"/>
+      <w:r>
+        <w:rPr>
+          <w:color w:val="1A1A1A"/>
+          <w:sz w:val="18"/>
+          <w:szCs w:val="18"/>
+        </w:rPr>
+        <w:t xml:space="preserve"> </w:t>
+      </w:r>
+      <w:proofErr w:type="spellStart"/>
+      <w:r>
+        <w:rPr>
+          <w:color w:val="1A1A1A"/>
+          <w:sz w:val="18"/>
+          <w:szCs w:val="18"/>
+        </w:rPr>
+        <w:t>leur</w:t>
+      </w:r>
+      <w:proofErr w:type="spellEnd"/>
+      <w:r>
+        <w:rPr>
+          <w:color w:val="1A1A1A"/>
+          <w:sz w:val="18"/>
+          <w:szCs w:val="18"/>
+        </w:rPr>
+        <w:t xml:space="preserve"> exploitation </w:t>
       </w:r>
       <w:proofErr w:type="gramStart"/>
       <w:r>
@@ -748,6 +1713,7 @@
           <w:szCs w:val="18"/>
         </w:rPr>
       </w:pPr>
+      <w:proofErr w:type="spellStart"/>
       <w:r>
         <w:rPr>
           <w:i/>
@@ -755,7 +1721,37 @@
           <w:sz w:val="18"/>
           <w:szCs w:val="18"/>
         </w:rPr>
-        <w:t>Efrei - École d'ingénieur du numérique - Villejuif</w:t>
+        <w:t>Efrei</w:t>
+      </w:r>
+      <w:proofErr w:type="spellEnd"/>
+      <w:r>
+        <w:rPr>
+          <w:i/>
+          <w:color w:val="1A1A1A"/>
+          <w:sz w:val="18"/>
+          <w:szCs w:val="18"/>
+        </w:rPr>
+        <w:t xml:space="preserve"> - École </w:t>
+      </w:r>
+      <w:proofErr w:type="spellStart"/>
+      <w:r>
+        <w:rPr>
+          <w:i/>
+          <w:color w:val="1A1A1A"/>
+          <w:sz w:val="18"/>
+          <w:szCs w:val="18"/>
+        </w:rPr>
+        <w:t>d'ingénieur</w:t>
+      </w:r>
+      <w:proofErr w:type="spellEnd"/>
+      <w:r>
+        <w:rPr>
+          <w:i/>
+          <w:color w:val="1A1A1A"/>
+          <w:sz w:val="18"/>
+          <w:szCs w:val="18"/>
+        </w:rPr>
+        <w:t xml:space="preserve"> du numérique - Villejuif</w:t>
       </w:r>
     </w:p>
     <w:p>
@@ -769,6 +1765,7 @@
           <w:szCs w:val="18"/>
         </w:rPr>
       </w:pPr>
+      <w:proofErr w:type="spellStart"/>
       <w:r>
         <w:rPr>
           <w:b/>
@@ -776,7 +1773,17 @@
           <w:sz w:val="18"/>
           <w:szCs w:val="18"/>
         </w:rPr>
-        <w:t>Licence Informatique</w:t>
+        <w:t>Licence</w:t>
+      </w:r>
+      <w:proofErr w:type="spellEnd"/>
+      <w:r>
+        <w:rPr>
+          <w:b/>
+          <w:color w:val="1A1A1A"/>
+          <w:sz w:val="18"/>
+          <w:szCs w:val="18"/>
+        </w:rPr>
+        <w:t xml:space="preserve"> Informatique</w:t>
       </w:r>
       <w:r>
         <w:rPr>
@@ -804,8 +1811,19 @@
           <w:sz w:val="18"/>
           <w:szCs w:val="18"/>
         </w:rPr>
-        <w:t>Université Sorbonne Paris Nord - Villetaneuse</w:t>
-      </w:r>
+        <w:t xml:space="preserve">Université Sorbonne Paris Nord - </w:t>
+      </w:r>
+      <w:proofErr w:type="spellStart"/>
+      <w:r>
+        <w:rPr>
+          <w:i/>
+          <w:color w:val="1A1A1A"/>
+          <w:sz w:val="18"/>
+          <w:szCs w:val="18"/>
+        </w:rPr>
+        <w:t>Villetaneuse</w:t>
+      </w:r>
+      <w:proofErr w:type="spellEnd"/>
     </w:p>
     <w:p>
       <w:pPr>
@@ -1049,6 +2067,7 @@
           <w:szCs w:val="18"/>
         </w:rPr>
       </w:pPr>
+      <w:proofErr w:type="spellStart"/>
       <w:proofErr w:type="gramStart"/>
       <w:r>
         <w:rPr>
@@ -1057,7 +2076,17 @@
           <w:sz w:val="18"/>
           <w:szCs w:val="18"/>
         </w:rPr>
-        <w:t>Langages :</w:t>
+        <w:t>Langages</w:t>
+      </w:r>
+      <w:proofErr w:type="spellEnd"/>
+      <w:r>
+        <w:rPr>
+          <w:b/>
+          <w:color w:val="1A1A1A"/>
+          <w:sz w:val="18"/>
+          <w:szCs w:val="18"/>
+        </w:rPr>
+        <w:t xml:space="preserve"> :</w:t>
       </w:r>
       <w:proofErr w:type="gramEnd"/>
       <w:r>
@@ -1086,6 +2115,7 @@
           <w:szCs w:val="18"/>
         </w:rPr>
       </w:pPr>
+      <w:proofErr w:type="spellStart"/>
       <w:r>
         <w:rPr>
           <w:b/>
@@ -1093,7 +2123,17 @@
           <w:sz w:val="18"/>
           <w:szCs w:val="18"/>
         </w:rPr>
-        <w:t xml:space="preserve">Analyse de </w:t>
+        <w:t>Analyse</w:t>
+      </w:r>
+      <w:proofErr w:type="spellEnd"/>
+      <w:r>
+        <w:rPr>
+          <w:b/>
+          <w:color w:val="1A1A1A"/>
+          <w:sz w:val="18"/>
+          <w:szCs w:val="18"/>
+        </w:rPr>
+        <w:t xml:space="preserve"> de </w:t>
       </w:r>
       <w:proofErr w:type="gramStart"/>
       <w:r>
@@ -1115,13 +2155,131 @@
         </w:rPr>
         <w:t xml:space="preserve"> </w:t>
       </w:r>
-      <w:r>
-        <w:rPr>
-          <w:color w:val="1A1A1A"/>
-          <w:sz w:val="18"/>
-          <w:szCs w:val="18"/>
-        </w:rPr>
-        <w:t>Analyse exploratoire (EDA), Nettoyage et préparation des données, Statistiques descriptives, Analyse de tendances, KPI, Visualisation de données</w:t>
+      <w:proofErr w:type="spellStart"/>
+      <w:r>
+        <w:rPr>
+          <w:color w:val="1A1A1A"/>
+          <w:sz w:val="18"/>
+          <w:szCs w:val="18"/>
+        </w:rPr>
+        <w:t>Analyse</w:t>
+      </w:r>
+      <w:proofErr w:type="spellEnd"/>
+      <w:r>
+        <w:rPr>
+          <w:color w:val="1A1A1A"/>
+          <w:sz w:val="18"/>
+          <w:szCs w:val="18"/>
+        </w:rPr>
+        <w:t xml:space="preserve"> </w:t>
+      </w:r>
+      <w:proofErr w:type="spellStart"/>
+      <w:r>
+        <w:rPr>
+          <w:color w:val="1A1A1A"/>
+          <w:sz w:val="18"/>
+          <w:szCs w:val="18"/>
+        </w:rPr>
+        <w:t>exploratoire</w:t>
+      </w:r>
+      <w:proofErr w:type="spellEnd"/>
+      <w:r>
+        <w:rPr>
+          <w:color w:val="1A1A1A"/>
+          <w:sz w:val="18"/>
+          <w:szCs w:val="18"/>
+        </w:rPr>
+        <w:t xml:space="preserve"> (EDA), </w:t>
+      </w:r>
+      <w:proofErr w:type="spellStart"/>
+      <w:r>
+        <w:rPr>
+          <w:color w:val="1A1A1A"/>
+          <w:sz w:val="18"/>
+          <w:szCs w:val="18"/>
+        </w:rPr>
+        <w:t>Nettoyage</w:t>
+      </w:r>
+      <w:proofErr w:type="spellEnd"/>
+      <w:r>
+        <w:rPr>
+          <w:color w:val="1A1A1A"/>
+          <w:sz w:val="18"/>
+          <w:szCs w:val="18"/>
+        </w:rPr>
+        <w:t xml:space="preserve"> et </w:t>
+      </w:r>
+      <w:proofErr w:type="spellStart"/>
+      <w:r>
+        <w:rPr>
+          <w:color w:val="1A1A1A"/>
+          <w:sz w:val="18"/>
+          <w:szCs w:val="18"/>
+        </w:rPr>
+        <w:t>préparation</w:t>
+      </w:r>
+      <w:proofErr w:type="spellEnd"/>
+      <w:r>
+        <w:rPr>
+          <w:color w:val="1A1A1A"/>
+          <w:sz w:val="18"/>
+          <w:szCs w:val="18"/>
+        </w:rPr>
+        <w:t xml:space="preserve"> des données, </w:t>
+      </w:r>
+      <w:proofErr w:type="spellStart"/>
+      <w:r>
+        <w:rPr>
+          <w:color w:val="1A1A1A"/>
+          <w:sz w:val="18"/>
+          <w:szCs w:val="18"/>
+        </w:rPr>
+        <w:t>Statistiques</w:t>
+      </w:r>
+      <w:proofErr w:type="spellEnd"/>
+      <w:r>
+        <w:rPr>
+          <w:color w:val="1A1A1A"/>
+          <w:sz w:val="18"/>
+          <w:szCs w:val="18"/>
+        </w:rPr>
+        <w:t xml:space="preserve"> descriptives, </w:t>
+      </w:r>
+      <w:proofErr w:type="spellStart"/>
+      <w:r>
+        <w:rPr>
+          <w:color w:val="1A1A1A"/>
+          <w:sz w:val="18"/>
+          <w:szCs w:val="18"/>
+        </w:rPr>
+        <w:t>Analyse</w:t>
+      </w:r>
+      <w:proofErr w:type="spellEnd"/>
+      <w:r>
+        <w:rPr>
+          <w:color w:val="1A1A1A"/>
+          <w:sz w:val="18"/>
+          <w:szCs w:val="18"/>
+        </w:rPr>
+        <w:t xml:space="preserve"> de tendances, KPI, </w:t>
+      </w:r>
+      <w:proofErr w:type="spellStart"/>
+      <w:r>
+        <w:rPr>
+          <w:color w:val="1A1A1A"/>
+          <w:sz w:val="18"/>
+          <w:szCs w:val="18"/>
+        </w:rPr>
+        <w:t>Visualisation</w:t>
+      </w:r>
+      <w:proofErr w:type="spellEnd"/>
+      <w:r>
+        <w:rPr>
+          <w:color w:val="1A1A1A"/>
+          <w:sz w:val="18"/>
+          <w:szCs w:val="18"/>
+        </w:rPr>
+        <w:t xml:space="preserve"> de données</w:t>
       </w:r>
     </w:p>
     <w:p>
@@ -1167,7 +2325,58 @@
           <w:sz w:val="18"/>
           <w:szCs w:val="18"/>
         </w:rPr>
-        <w:t>Power BI, Power Query, Tableau, SSRS, Excel, SQL Server, T-SQL</w:t>
+        <w:t>Power BI, Power Query, Tableau, SSRS,</w:t>
+      </w:r>
+      <w:r>
+        <w:rPr>
+          <w:color w:val="1A1A1A"/>
+          <w:sz w:val="18"/>
+          <w:szCs w:val="18"/>
+        </w:rPr>
+        <w:t xml:space="preserve"> </w:t>
+      </w:r>
+      <w:r>
+        <w:rPr>
+          <w:color w:val="1A1A1A"/>
+          <w:sz w:val="18"/>
+          <w:szCs w:val="18"/>
+        </w:rPr>
+        <w:t>SQL Server, T-SQL</w:t>
+      </w:r>
+      <w:r>
+        <w:rPr>
+          <w:color w:val="1A1A1A"/>
+          <w:sz w:val="18"/>
+          <w:szCs w:val="18"/>
+        </w:rPr>
+        <w:t>,</w:t>
+      </w:r>
+      <w:r>
+        <w:rPr>
+          <w:b/>
+          <w:color w:val="1A1A1A"/>
+          <w:sz w:val="18"/>
+          <w:szCs w:val="18"/>
+        </w:rPr>
+        <w:t xml:space="preserve"> </w:t>
+      </w:r>
+      <w:proofErr w:type="spellStart"/>
+      <w:r>
+        <w:rPr>
+          <w:color w:val="1A1A1A"/>
+          <w:sz w:val="18"/>
+          <w:szCs w:val="18"/>
+        </w:rPr>
+        <w:t>Modélisation</w:t>
+      </w:r>
+      <w:proofErr w:type="spellEnd"/>
+      <w:r>
+        <w:rPr>
+          <w:color w:val="1A1A1A"/>
+          <w:sz w:val="18"/>
+          <w:szCs w:val="18"/>
+        </w:rPr>
+        <w:t xml:space="preserve"> de données, ETL/ELT, SSIS</w:t>
       </w:r>
     </w:p>
     <w:p>
@@ -1187,6 +2396,7 @@
         </w:rPr>
         <w:t xml:space="preserve">Data </w:t>
       </w:r>
+      <w:proofErr w:type="spellStart"/>
       <w:proofErr w:type="gramStart"/>
       <w:r>
         <w:rPr>
@@ -1195,7 +2405,17 @@
           <w:sz w:val="18"/>
           <w:szCs w:val="18"/>
         </w:rPr>
-        <w:t>Visualisation :</w:t>
+        <w:t>Visualisation</w:t>
+      </w:r>
+      <w:proofErr w:type="spellEnd"/>
+      <w:r>
+        <w:rPr>
+          <w:b/>
+          <w:color w:val="1A1A1A"/>
+          <w:sz w:val="18"/>
+          <w:szCs w:val="18"/>
+        </w:rPr>
+        <w:t xml:space="preserve"> :</w:t>
       </w:r>
       <w:proofErr w:type="gramEnd"/>
       <w:r>
@@ -1213,13 +2433,42 @@
           <w:sz w:val="18"/>
           <w:szCs w:val="18"/>
         </w:rPr>
-        <w:t>Matplotlib, Plotly, Streamlit</w:t>
-      </w:r>
+        <w:t xml:space="preserve">Matplotlib, </w:t>
+      </w:r>
+      <w:proofErr w:type="spellStart"/>
+      <w:r>
+        <w:rPr>
+          <w:color w:val="1A1A1A"/>
+          <w:sz w:val="18"/>
+          <w:szCs w:val="18"/>
+        </w:rPr>
+        <w:t>Plotly</w:t>
+      </w:r>
+      <w:proofErr w:type="spellEnd"/>
+      <w:r>
+        <w:rPr>
+          <w:color w:val="1A1A1A"/>
+          <w:sz w:val="18"/>
+          <w:szCs w:val="18"/>
+        </w:rPr>
+        <w:t xml:space="preserve">, </w:t>
+      </w:r>
+      <w:proofErr w:type="spellStart"/>
+      <w:r>
+        <w:rPr>
+          <w:color w:val="1A1A1A"/>
+          <w:sz w:val="18"/>
+          <w:szCs w:val="18"/>
+        </w:rPr>
+        <w:t>Streamlit</w:t>
+      </w:r>
+      <w:proofErr w:type="spellEnd"/>
     </w:p>
     <w:p>
       <w:pPr>
         <w:spacing w:after="60" w:line="240" w:lineRule="auto"/>
         <w:rPr>
+          <w:color w:val="1A1A1A"/>
           <w:sz w:val="18"/>
           <w:szCs w:val="18"/>
         </w:rPr>
@@ -1227,27 +2476,36 @@
       <w:r>
         <w:rPr>
           <w:b/>
-          <w:color w:val="1A1A1A"/>
-          <w:sz w:val="18"/>
-          <w:szCs w:val="18"/>
-        </w:rPr>
-        <w:t xml:space="preserve">Bases de données &amp; </w:t>
+          <w:bCs/>
+          <w:sz w:val="18"/>
+          <w:szCs w:val="18"/>
+        </w:rPr>
+        <w:t xml:space="preserve">Cloud &amp; Data </w:t>
       </w:r>
       <w:proofErr w:type="gramStart"/>
       <w:r>
         <w:rPr>
           <w:b/>
-          <w:color w:val="1A1A1A"/>
-          <w:sz w:val="18"/>
-          <w:szCs w:val="18"/>
-        </w:rPr>
-        <w:t>Data :</w:t>
+          <w:bCs/>
+          <w:sz w:val="18"/>
+          <w:szCs w:val="18"/>
+        </w:rPr>
+        <w:t>Platform</w:t>
+      </w:r>
+      <w:r>
+        <w:rPr>
+          <w:b/>
+          <w:bCs/>
+          <w:sz w:val="18"/>
+          <w:szCs w:val="18"/>
+        </w:rPr>
+        <w:t xml:space="preserve"> :</w:t>
       </w:r>
       <w:proofErr w:type="gramEnd"/>
       <w:r>
         <w:rPr>
           <w:b/>
-          <w:color w:val="1A1A1A"/>
+          <w:bCs/>
           <w:sz w:val="18"/>
           <w:szCs w:val="18"/>
         </w:rPr>
@@ -1255,11 +2513,63 @@
       </w:r>
       <w:r>
         <w:rPr>
-          <w:color w:val="1A1A1A"/>
-          <w:sz w:val="18"/>
-          <w:szCs w:val="18"/>
-        </w:rPr>
-        <w:t>Modélisation de données, ETL/ELT, SSIS, Azure Data Factory, Azure Synapse Analytics</w:t>
+          <w:sz w:val="18"/>
+          <w:szCs w:val="18"/>
+          <w:lang w:val="fr-FR"/>
+        </w:rPr>
+        <w:t xml:space="preserve">Azure, Azure Data Lake Storage, Microsoft </w:t>
+      </w:r>
+      <w:proofErr w:type="spellStart"/>
+      <w:r>
+        <w:rPr>
+          <w:sz w:val="18"/>
+          <w:szCs w:val="18"/>
+          <w:lang w:val="fr-FR"/>
+        </w:rPr>
+        <w:t>Fabric</w:t>
+      </w:r>
+      <w:proofErr w:type="spellEnd"/>
+      <w:r>
+        <w:rPr>
+          <w:sz w:val="18"/>
+          <w:szCs w:val="18"/>
+          <w:lang w:val="fr-FR"/>
+        </w:rPr>
+        <w:t xml:space="preserve">, </w:t>
+      </w:r>
+      <w:proofErr w:type="spellStart"/>
+      <w:r>
+        <w:rPr>
+          <w:sz w:val="18"/>
+          <w:szCs w:val="18"/>
+          <w:lang w:val="fr-FR"/>
+        </w:rPr>
+        <w:t>Lakehouse</w:t>
+      </w:r>
+      <w:proofErr w:type="spellEnd"/>
+      <w:r>
+        <w:rPr>
+          <w:sz w:val="18"/>
+          <w:szCs w:val="18"/>
+          <w:lang w:val="fr-FR"/>
+        </w:rPr>
+        <w:t>, Data Warehouse</w:t>
+      </w:r>
+      <w:r>
+        <w:rPr>
+          <w:sz w:val="18"/>
+          <w:szCs w:val="18"/>
+          <w:lang w:val="fr-FR"/>
+        </w:rPr>
+        <w:t xml:space="preserve">, </w:t>
+      </w:r>
+      <w:r>
+        <w:rPr>
+          <w:color w:val="1A1A1A"/>
+          <w:sz w:val="18"/>
+          <w:szCs w:val="18"/>
+        </w:rPr>
+        <w:t>Azure Data Factory, Azure Synapse Analytics</w:t>
       </w:r>
     </w:p>
     <w:p>
@@ -1270,6 +2580,7 @@
           <w:szCs w:val="18"/>
         </w:rPr>
       </w:pPr>
+      <w:proofErr w:type="spellStart"/>
       <w:proofErr w:type="gramStart"/>
       <w:r>
         <w:rPr>
@@ -1278,7 +2589,17 @@
           <w:sz w:val="18"/>
           <w:szCs w:val="18"/>
         </w:rPr>
-        <w:t>Outils :</w:t>
+        <w:t>Outils</w:t>
+      </w:r>
+      <w:proofErr w:type="spellEnd"/>
+      <w:r>
+        <w:rPr>
+          <w:b/>
+          <w:color w:val="1A1A1A"/>
+          <w:sz w:val="18"/>
+          <w:szCs w:val="18"/>
+        </w:rPr>
+        <w:t xml:space="preserve"> :</w:t>
       </w:r>
       <w:proofErr w:type="gramEnd"/>
       <w:r>
@@ -1320,20 +2641,99 @@
     </w:p>
     <w:p>
       <w:pPr>
+        <w:spacing w:after="60" w:line="240" w:lineRule="auto"/>
+        <w:rPr>
+          <w:b/>
+          <w:bCs/>
+          <w:sz w:val="18"/>
+          <w:szCs w:val="18"/>
+        </w:rPr>
+      </w:pPr>
+      <w:proofErr w:type="spellStart"/>
+      <w:r>
+        <w:rPr>
+          <w:b/>
+          <w:bCs/>
+          <w:sz w:val="18"/>
+          <w:szCs w:val="18"/>
+        </w:rPr>
+        <w:t>AssurNova</w:t>
+      </w:r>
+      <w:proofErr w:type="spellEnd"/>
+      <w:r>
+        <w:rPr>
+          <w:b/>
+          <w:bCs/>
+          <w:sz w:val="18"/>
+          <w:szCs w:val="18"/>
+        </w:rPr>
+        <w:t xml:space="preserve"> – </w:t>
+      </w:r>
+      <w:proofErr w:type="spellStart"/>
+      <w:r>
+        <w:rPr>
+          <w:b/>
+          <w:bCs/>
+          <w:sz w:val="18"/>
+          <w:szCs w:val="18"/>
+        </w:rPr>
+        <w:t>Portefeuille</w:t>
+      </w:r>
+      <w:proofErr w:type="spellEnd"/>
+      <w:r>
+        <w:rPr>
+          <w:b/>
+          <w:bCs/>
+          <w:sz w:val="18"/>
+          <w:szCs w:val="18"/>
+        </w:rPr>
+        <w:t xml:space="preserve"> Clients &amp; </w:t>
+      </w:r>
+      <w:proofErr w:type="spellStart"/>
+      <w:r>
+        <w:rPr>
+          <w:b/>
+          <w:bCs/>
+          <w:sz w:val="18"/>
+          <w:szCs w:val="18"/>
+        </w:rPr>
+        <w:t>Ciblage</w:t>
+      </w:r>
+      <w:proofErr w:type="spellEnd"/>
+      <w:r>
+        <w:rPr>
+          <w:b/>
+          <w:bCs/>
+          <w:sz w:val="18"/>
+          <w:szCs w:val="18"/>
+        </w:rPr>
+        <w:t xml:space="preserve"> Marketing</w:t>
+      </w:r>
+    </w:p>
+    <w:p>
+      <w:pPr>
         <w:pStyle w:val="Paragraphedeliste"/>
         <w:numPr>
           <w:ilvl w:val="0"/>
-          <w:numId w:val="18"/>
+          <w:numId w:val="19"/>
         </w:numPr>
         <w:spacing w:after="60" w:line="240" w:lineRule="auto"/>
         <w:rPr>
+          <w:sz w:val="18"/>
+          <w:szCs w:val="18"/>
+        </w:rPr>
+      </w:pPr>
+      <w:proofErr w:type="gramStart"/>
+      <w:r>
+        <w:rPr>
           <w:b/>
           <w:bCs/>
           <w:sz w:val="18"/>
           <w:szCs w:val="18"/>
-        </w:rPr>
-      </w:pPr>
-      <w:proofErr w:type="spellStart"/>
+          <w:u w:val="single"/>
+        </w:rPr>
+        <w:t>Stack</w:t>
+      </w:r>
       <w:r>
         <w:rPr>
           <w:b/>
@@ -1341,104 +2741,39 @@
           <w:sz w:val="18"/>
           <w:szCs w:val="18"/>
         </w:rPr>
-        <w:t>AssurNova</w:t>
-      </w:r>
-      <w:proofErr w:type="spellEnd"/>
+        <w:t xml:space="preserve"> :</w:t>
+      </w:r>
+      <w:proofErr w:type="gramEnd"/>
+      <w:r>
+        <w:rPr>
+          <w:sz w:val="18"/>
+          <w:szCs w:val="18"/>
+        </w:rPr>
+        <w:t xml:space="preserve"> Power BI, DAX, Power Query, SQL Server, RLS</w:t>
+      </w:r>
+    </w:p>
+    <w:p>
+      <w:pPr>
+        <w:pStyle w:val="Paragraphedeliste"/>
+        <w:numPr>
+          <w:ilvl w:val="0"/>
+          <w:numId w:val="19"/>
+        </w:numPr>
+        <w:spacing w:after="60" w:line="240" w:lineRule="auto"/>
+        <w:rPr>
+          <w:sz w:val="18"/>
+          <w:szCs w:val="18"/>
+        </w:rPr>
+      </w:pPr>
+      <w:proofErr w:type="spellStart"/>
+      <w:proofErr w:type="gramStart"/>
       <w:r>
         <w:rPr>
           <w:b/>
           <w:bCs/>
           <w:sz w:val="18"/>
           <w:szCs w:val="18"/>
-        </w:rPr>
-        <w:t xml:space="preserve"> – </w:t>
-      </w:r>
-      <w:proofErr w:type="spellStart"/>
-      <w:r>
-        <w:rPr>
-          <w:b/>
-          <w:bCs/>
-          <w:sz w:val="18"/>
-          <w:szCs w:val="18"/>
-        </w:rPr>
-        <w:t>Portefeuille</w:t>
-      </w:r>
-      <w:proofErr w:type="spellEnd"/>
-      <w:r>
-        <w:rPr>
-          <w:b/>
-          <w:bCs/>
-          <w:sz w:val="18"/>
-          <w:szCs w:val="18"/>
-        </w:rPr>
-        <w:t xml:space="preserve"> Clients &amp; </w:t>
-      </w:r>
-      <w:proofErr w:type="spellStart"/>
-      <w:r>
-        <w:rPr>
-          <w:b/>
-          <w:bCs/>
-          <w:sz w:val="18"/>
-          <w:szCs w:val="18"/>
-        </w:rPr>
-        <w:t>Ciblage</w:t>
-      </w:r>
-      <w:proofErr w:type="spellEnd"/>
-      <w:r>
-        <w:rPr>
-          <w:b/>
-          <w:bCs/>
-          <w:sz w:val="18"/>
-          <w:szCs w:val="18"/>
-        </w:rPr>
-        <w:t xml:space="preserve"> Marketing</w:t>
-      </w:r>
-    </w:p>
-    <w:p>
-      <w:pPr>
-        <w:spacing w:after="60" w:line="240" w:lineRule="auto"/>
-        <w:ind w:left="255"/>
-        <w:rPr>
-          <w:sz w:val="18"/>
-          <w:szCs w:val="18"/>
-        </w:rPr>
-      </w:pPr>
-      <w:proofErr w:type="gramStart"/>
-      <w:r>
-        <w:rPr>
-          <w:b/>
-          <w:bCs/>
-          <w:sz w:val="18"/>
-          <w:szCs w:val="18"/>
-        </w:rPr>
-        <w:t>Stack :</w:t>
-      </w:r>
-      <w:proofErr w:type="gramEnd"/>
-      <w:r>
-        <w:rPr>
-          <w:sz w:val="18"/>
-          <w:szCs w:val="18"/>
-        </w:rPr>
-        <w:t xml:space="preserve"> Power BI, DAX, Power Query, SQL Server, RLS</w:t>
-      </w:r>
-    </w:p>
-    <w:p>
-      <w:pPr>
-        <w:spacing w:after="60" w:line="240" w:lineRule="auto"/>
-        <w:ind w:left="255"/>
-        <w:rPr>
-          <w:sz w:val="18"/>
-          <w:szCs w:val="18"/>
-        </w:rPr>
-      </w:pPr>
-      <w:proofErr w:type="spellStart"/>
-      <w:proofErr w:type="gramStart"/>
-      <w:r>
-        <w:rPr>
-          <w:b/>
-          <w:bCs/>
-          <w:sz w:val="18"/>
-          <w:szCs w:val="18"/>
+          <w:u w:val="single"/>
         </w:rPr>
         <w:t>Résultat</w:t>
       </w:r>
@@ -1534,10 +2869,30 @@
     </w:p>
     <w:p>
       <w:pPr>
+        <w:spacing w:after="60" w:line="240" w:lineRule="auto"/>
+        <w:rPr>
+          <w:b/>
+          <w:bCs/>
+          <w:sz w:val="18"/>
+          <w:szCs w:val="18"/>
+        </w:rPr>
+      </w:pPr>
+      <w:r>
+        <w:rPr>
+          <w:b/>
+          <w:bCs/>
+          <w:sz w:val="18"/>
+          <w:szCs w:val="18"/>
+        </w:rPr>
+        <w:t>Retail Sales Analytics – Fabric &amp; Power BI</w:t>
+      </w:r>
+    </w:p>
+    <w:p>
+      <w:pPr>
         <w:pStyle w:val="Paragraphedeliste"/>
         <w:numPr>
           <w:ilvl w:val="0"/>
-          <w:numId w:val="18"/>
+          <w:numId w:val="20"/>
         </w:numPr>
         <w:spacing w:after="60" w:line="240" w:lineRule="auto"/>
         <w:rPr>
@@ -1545,23 +2900,47 @@
           <w:szCs w:val="18"/>
         </w:rPr>
       </w:pPr>
-      <w:r>
-        <w:rPr>
-          <w:sz w:val="18"/>
-          <w:szCs w:val="18"/>
-        </w:rPr>
-        <w:t>Retail Sales Analytics – Fabric &amp; Power BI</w:t>
+      <w:proofErr w:type="gramStart"/>
+      <w:r>
+        <w:rPr>
+          <w:b/>
+          <w:bCs/>
+          <w:sz w:val="18"/>
+          <w:szCs w:val="18"/>
+          <w:u w:val="single"/>
+        </w:rPr>
+        <w:t>Stack</w:t>
+      </w:r>
+      <w:r>
+        <w:rPr>
+          <w:sz w:val="18"/>
+          <w:szCs w:val="18"/>
+        </w:rPr>
+        <w:t xml:space="preserve"> :</w:t>
+      </w:r>
+      <w:proofErr w:type="gramEnd"/>
+      <w:r>
+        <w:rPr>
+          <w:sz w:val="18"/>
+          <w:szCs w:val="18"/>
+        </w:rPr>
+        <w:t xml:space="preserve"> Microsoft Fabric, Power BI, DAX</w:t>
       </w:r>
     </w:p>
     <w:p>
       <w:pPr>
+        <w:pStyle w:val="Paragraphedeliste"/>
+        <w:numPr>
+          <w:ilvl w:val="0"/>
+          <w:numId w:val="20"/>
+        </w:numPr>
         <w:spacing w:after="60" w:line="240" w:lineRule="auto"/>
-        <w:ind w:left="255"/>
-        <w:rPr>
-          <w:sz w:val="18"/>
-          <w:szCs w:val="18"/>
-        </w:rPr>
-      </w:pPr>
+        <w:rPr>
+          <w:sz w:val="18"/>
+          <w:szCs w:val="18"/>
+        </w:rPr>
+      </w:pPr>
+      <w:proofErr w:type="spellStart"/>
       <w:proofErr w:type="gramStart"/>
       <w:r>
         <w:rPr>
@@ -1569,42 +2948,7 @@
           <w:bCs/>
           <w:sz w:val="18"/>
           <w:szCs w:val="18"/>
-        </w:rPr>
-        <w:t>Stack</w:t>
-      </w:r>
-      <w:r>
-        <w:rPr>
-          <w:sz w:val="18"/>
-          <w:szCs w:val="18"/>
-        </w:rPr>
-        <w:t xml:space="preserve"> :</w:t>
-      </w:r>
-      <w:proofErr w:type="gramEnd"/>
-      <w:r>
-        <w:rPr>
-          <w:sz w:val="18"/>
-          <w:szCs w:val="18"/>
-        </w:rPr>
-        <w:t xml:space="preserve"> Microsoft Fabric, Power BI, DAX</w:t>
-      </w:r>
-    </w:p>
-    <w:p>
-      <w:pPr>
-        <w:spacing w:after="60" w:line="240" w:lineRule="auto"/>
-        <w:ind w:left="255"/>
-        <w:rPr>
-          <w:sz w:val="18"/>
-          <w:szCs w:val="18"/>
-        </w:rPr>
-      </w:pPr>
-      <w:proofErr w:type="spellStart"/>
-      <w:proofErr w:type="gramStart"/>
-      <w:r>
-        <w:rPr>
-          <w:b/>
-          <w:bCs/>
-          <w:sz w:val="18"/>
-          <w:szCs w:val="18"/>
+          <w:u w:val="single"/>
         </w:rPr>
         <w:t>Résultat</w:t>
       </w:r>
@@ -1684,10 +3028,30 @@
     </w:p>
     <w:p>
       <w:pPr>
+        <w:spacing w:after="60" w:line="240" w:lineRule="auto"/>
+        <w:rPr>
+          <w:b/>
+          <w:bCs/>
+          <w:sz w:val="18"/>
+          <w:szCs w:val="18"/>
+        </w:rPr>
+      </w:pPr>
+      <w:r>
+        <w:rPr>
+          <w:b/>
+          <w:bCs/>
+          <w:sz w:val="18"/>
+          <w:szCs w:val="18"/>
+        </w:rPr>
+        <w:t>Financial Analytics – Fabric &amp; Power BI</w:t>
+      </w:r>
+    </w:p>
+    <w:p>
+      <w:pPr>
         <w:pStyle w:val="Paragraphedeliste"/>
         <w:numPr>
           <w:ilvl w:val="0"/>
-          <w:numId w:val="18"/>
+          <w:numId w:val="21"/>
         </w:numPr>
         <w:spacing w:after="60" w:line="240" w:lineRule="auto"/>
         <w:rPr>
@@ -1695,23 +3059,6 @@
           <w:szCs w:val="18"/>
         </w:rPr>
       </w:pPr>
-      <w:r>
-        <w:rPr>
-          <w:sz w:val="18"/>
-          <w:szCs w:val="18"/>
-        </w:rPr>
-        <w:t>Financial Analytics – Fabric &amp; Power BI</w:t>
-      </w:r>
-    </w:p>
-    <w:p>
-      <w:pPr>
-        <w:spacing w:after="60" w:line="240" w:lineRule="auto"/>
-        <w:ind w:left="255"/>
-        <w:rPr>
-          <w:sz w:val="18"/>
-          <w:szCs w:val="18"/>
-        </w:rPr>
-      </w:pPr>
       <w:proofErr w:type="gramStart"/>
       <w:r>
         <w:rPr>
@@ -1719,6 +3066,7 @@
           <w:bCs/>
           <w:sz w:val="18"/>
           <w:szCs w:val="18"/>
+          <w:u w:val="single"/>
         </w:rPr>
         <w:t>Stack</w:t>
       </w:r>
@@ -1752,75 +3100,6 @@
           <w:szCs w:val="18"/>
         </w:rPr>
         <w:t>, Power BI</w:t>
-      </w:r>
-    </w:p>
-    <w:p>
-      <w:pPr>
-        <w:spacing w:after="60" w:line="240" w:lineRule="auto"/>
-        <w:ind w:left="255"/>
-        <w:rPr>
-          <w:sz w:val="18"/>
-          <w:szCs w:val="18"/>
-        </w:rPr>
-      </w:pPr>
-      <w:proofErr w:type="spellStart"/>
-      <w:proofErr w:type="gramStart"/>
-      <w:r>
-        <w:rPr>
-          <w:b/>
-          <w:bCs/>
-          <w:sz w:val="18"/>
-          <w:szCs w:val="18"/>
-        </w:rPr>
-        <w:t>Résultat</w:t>
-      </w:r>
-      <w:proofErr w:type="spellEnd"/>
-      <w:r>
-        <w:rPr>
-          <w:sz w:val="18"/>
-          <w:szCs w:val="18"/>
-        </w:rPr>
-        <w:t xml:space="preserve"> :</w:t>
-      </w:r>
-      <w:proofErr w:type="gramEnd"/>
-      <w:r>
-        <w:rPr>
-          <w:sz w:val="18"/>
-          <w:szCs w:val="18"/>
-        </w:rPr>
-        <w:t xml:space="preserve"> Pilotage financier (EBITDA, budget vs </w:t>
-      </w:r>
-      <w:proofErr w:type="spellStart"/>
-      <w:r>
-        <w:rPr>
-          <w:sz w:val="18"/>
-          <w:szCs w:val="18"/>
-        </w:rPr>
-        <w:t>réalisé</w:t>
-      </w:r>
-      <w:proofErr w:type="spellEnd"/>
-      <w:r>
-        <w:rPr>
-          <w:sz w:val="18"/>
-          <w:szCs w:val="18"/>
-        </w:rPr>
-        <w:t xml:space="preserve">), architecture </w:t>
-      </w:r>
-      <w:proofErr w:type="spellStart"/>
-      <w:r>
-        <w:rPr>
-          <w:sz w:val="18"/>
-          <w:szCs w:val="18"/>
-        </w:rPr>
-        <w:t>médaillon</w:t>
-      </w:r>
-      <w:proofErr w:type="spellEnd"/>
-      <w:r>
-        <w:rPr>
-          <w:sz w:val="18"/>
-          <w:szCs w:val="18"/>
-        </w:rPr>
-        <w:t xml:space="preserve"> Bronze/Silver/Gold</w:t>
       </w:r>
     </w:p>
     <w:p>
@@ -1828,7 +3107,7 @@
         <w:pStyle w:val="Paragraphedeliste"/>
         <w:numPr>
           <w:ilvl w:val="0"/>
-          <w:numId w:val="18"/>
+          <w:numId w:val="21"/>
         </w:numPr>
         <w:spacing w:after="60" w:line="240" w:lineRule="auto"/>
         <w:rPr>
@@ -1836,30 +3115,108 @@
           <w:szCs w:val="18"/>
         </w:rPr>
       </w:pPr>
-      <w:r>
-        <w:rPr>
-          <w:sz w:val="18"/>
-          <w:szCs w:val="18"/>
-        </w:rPr>
-        <w:t>Sales Forecasting &amp; Experimentation</w:t>
+      <w:proofErr w:type="spellStart"/>
+      <w:proofErr w:type="gramStart"/>
+      <w:r>
+        <w:rPr>
+          <w:b/>
+          <w:bCs/>
+          <w:sz w:val="18"/>
+          <w:szCs w:val="18"/>
+          <w:u w:val="single"/>
+        </w:rPr>
+        <w:t>Résultat</w:t>
+      </w:r>
+      <w:proofErr w:type="spellEnd"/>
+      <w:r>
+        <w:rPr>
+          <w:sz w:val="18"/>
+          <w:szCs w:val="18"/>
+        </w:rPr>
+        <w:t xml:space="preserve"> :</w:t>
+      </w:r>
+      <w:proofErr w:type="gramEnd"/>
+      <w:r>
+        <w:rPr>
+          <w:sz w:val="18"/>
+          <w:szCs w:val="18"/>
+        </w:rPr>
+        <w:t xml:space="preserve"> Pilotage financier (EBITDA, budget vs </w:t>
+      </w:r>
+      <w:proofErr w:type="spellStart"/>
+      <w:r>
+        <w:rPr>
+          <w:sz w:val="18"/>
+          <w:szCs w:val="18"/>
+        </w:rPr>
+        <w:t>réalisé</w:t>
+      </w:r>
+      <w:proofErr w:type="spellEnd"/>
+      <w:r>
+        <w:rPr>
+          <w:sz w:val="18"/>
+          <w:szCs w:val="18"/>
+        </w:rPr>
+        <w:t xml:space="preserve">), architecture </w:t>
+      </w:r>
+      <w:proofErr w:type="spellStart"/>
+      <w:r>
+        <w:rPr>
+          <w:sz w:val="18"/>
+          <w:szCs w:val="18"/>
+        </w:rPr>
+        <w:t>médaillon</w:t>
+      </w:r>
+      <w:proofErr w:type="spellEnd"/>
+      <w:r>
+        <w:rPr>
+          <w:sz w:val="18"/>
+          <w:szCs w:val="18"/>
+        </w:rPr>
+        <w:t xml:space="preserve"> Bronze/Silver/Gold</w:t>
       </w:r>
     </w:p>
     <w:p>
       <w:pPr>
         <w:spacing w:after="60" w:line="240" w:lineRule="auto"/>
-        <w:ind w:left="255"/>
-        <w:rPr>
-          <w:sz w:val="18"/>
-          <w:szCs w:val="18"/>
-        </w:rPr>
-      </w:pPr>
-      <w:proofErr w:type="gramStart"/>
-      <w:r>
         <w:rPr>
           <w:b/>
           <w:bCs/>
           <w:sz w:val="18"/>
           <w:szCs w:val="18"/>
+        </w:rPr>
+      </w:pPr>
+      <w:r>
+        <w:rPr>
+          <w:b/>
+          <w:bCs/>
+          <w:sz w:val="18"/>
+          <w:szCs w:val="18"/>
+        </w:rPr>
+        <w:t>Sales Forecasting &amp; Experimentation</w:t>
+      </w:r>
+    </w:p>
+    <w:p>
+      <w:pPr>
+        <w:pStyle w:val="Paragraphedeliste"/>
+        <w:numPr>
+          <w:ilvl w:val="0"/>
+          <w:numId w:val="22"/>
+        </w:numPr>
+        <w:spacing w:after="60" w:line="240" w:lineRule="auto"/>
+        <w:rPr>
+          <w:sz w:val="18"/>
+          <w:szCs w:val="18"/>
+        </w:rPr>
+      </w:pPr>
+      <w:proofErr w:type="gramStart"/>
+      <w:r>
+        <w:rPr>
+          <w:b/>
+          <w:bCs/>
+          <w:sz w:val="18"/>
+          <w:szCs w:val="18"/>
+          <w:u w:val="single"/>
         </w:rPr>
         <w:t>Stack</w:t>
       </w:r>
@@ -1890,8 +3247,12 @@
     </w:p>
     <w:p>
       <w:pPr>
+        <w:pStyle w:val="Paragraphedeliste"/>
+        <w:numPr>
+          <w:ilvl w:val="0"/>
+          <w:numId w:val="22"/>
+        </w:numPr>
         <w:spacing w:after="60" w:line="240" w:lineRule="auto"/>
-        <w:ind w:left="255"/>
         <w:rPr>
           <w:sz w:val="18"/>
           <w:szCs w:val="18"/>
@@ -1905,6 +3266,7 @@
           <w:bCs/>
           <w:sz w:val="18"/>
           <w:szCs w:val="18"/>
+          <w:u w:val="single"/>
         </w:rPr>
         <w:t>Résultat</w:t>
       </w:r>
@@ -2050,8 +3412,27 @@
           <w:sz w:val="18"/>
           <w:szCs w:val="18"/>
         </w:rPr>
-        <w:t xml:space="preserve"> (Intermédiaire), </w:t>
-      </w:r>
+        <w:t xml:space="preserve"> (</w:t>
+      </w:r>
+      <w:proofErr w:type="spellStart"/>
+      <w:r>
+        <w:rPr>
+          <w:color w:val="1A1A1A"/>
+          <w:sz w:val="18"/>
+          <w:szCs w:val="18"/>
+        </w:rPr>
+        <w:t>Intermédiaire</w:t>
+      </w:r>
+      <w:proofErr w:type="spellEnd"/>
+      <w:r>
+        <w:rPr>
+          <w:color w:val="1A1A1A"/>
+          <w:sz w:val="18"/>
+          <w:szCs w:val="18"/>
+        </w:rPr>
+        <w:t xml:space="preserve">), </w:t>
+      </w:r>
+      <w:proofErr w:type="spellStart"/>
       <w:r>
         <w:rPr>
           <w:b/>
@@ -2061,13 +3442,32 @@
         </w:rPr>
         <w:t>Espagnol</w:t>
       </w:r>
-      <w:r>
-        <w:rPr>
-          <w:color w:val="1A1A1A"/>
-          <w:sz w:val="18"/>
-          <w:szCs w:val="18"/>
-        </w:rPr>
-        <w:t xml:space="preserve"> (Débutant)</w:t>
+      <w:proofErr w:type="spellEnd"/>
+      <w:r>
+        <w:rPr>
+          <w:color w:val="1A1A1A"/>
+          <w:sz w:val="18"/>
+          <w:szCs w:val="18"/>
+        </w:rPr>
+        <w:t xml:space="preserve"> (</w:t>
+      </w:r>
+      <w:proofErr w:type="spellStart"/>
+      <w:r>
+        <w:rPr>
+          <w:color w:val="1A1A1A"/>
+          <w:sz w:val="18"/>
+          <w:szCs w:val="18"/>
+        </w:rPr>
+        <w:t>Débutant</w:t>
+      </w:r>
+      <w:proofErr w:type="spellEnd"/>
+      <w:r>
+        <w:rPr>
+          <w:color w:val="1A1A1A"/>
+          <w:sz w:val="18"/>
+          <w:szCs w:val="18"/>
+        </w:rPr>
+        <w:t>)</w:t>
       </w:r>
     </w:p>
     <w:sectPr>
@@ -2254,6 +3654,119 @@
     </w:lvl>
   </w:abstractNum>
   <w:abstractNum w:abstractNumId="9" w15:restartNumberingAfterBreak="0">
+    <w:nsid w:val="0E423734"/>
+    <w:multiLevelType w:val="hybridMultilevel"/>
+    <w:tmpl w:val="F89615C8"/>
+    <w:lvl w:ilvl="0" w:tplc="040C0001">
+      <w:start w:val="1"/>
+      <w:numFmt w:val="bullet"/>
+      <w:lvlText w:val=""/>
+      <w:lvlJc w:val="left"/>
+      <w:pPr>
+        <w:ind w:left="720" w:hanging="360"/>
+      </w:pPr>
+      <w:rPr>
+        <w:rFonts w:ascii="Symbol" w:hAnsi="Symbol" w:hint="default"/>
+      </w:rPr>
+    </w:lvl>
+    <w:lvl w:ilvl="1" w:tplc="040C0003" w:tentative="1">
+      <w:start w:val="1"/>
+      <w:numFmt w:val="bullet"/>
+      <w:lvlText w:val="o"/>
+      <w:lvlJc w:val="left"/>
+      <w:pPr>
+        <w:ind w:left="1440" w:hanging="360"/>
+      </w:pPr>
+      <w:rPr>
+        <w:rFonts w:ascii="Courier New" w:hAnsi="Courier New" w:cs="Courier New" w:hint="default"/>
+      </w:rPr>
+    </w:lvl>
+    <w:lvl w:ilvl="2" w:tplc="040C0005" w:tentative="1">
+      <w:start w:val="1"/>
+      <w:numFmt w:val="bullet"/>
+      <w:lvlText w:val=""/>
+      <w:lvlJc w:val="left"/>
+      <w:pPr>
+        <w:ind w:left="2160" w:hanging="360"/>
+      </w:pPr>
+      <w:rPr>
+        <w:rFonts w:ascii="Wingdings" w:hAnsi="Wingdings" w:hint="default"/>
+      </w:rPr>
+    </w:lvl>
+    <w:lvl w:ilvl="3" w:tplc="040C0001" w:tentative="1">
+      <w:start w:val="1"/>
+      <w:numFmt w:val="bullet"/>
+      <w:lvlText w:val=""/>
+      <w:lvlJc w:val="left"/>
+      <w:pPr>
+        <w:ind w:left="2880" w:hanging="360"/>
+      </w:pPr>
+      <w:rPr>
+        <w:rFonts w:ascii="Symbol" w:hAnsi="Symbol" w:hint="default"/>
+      </w:rPr>
+    </w:lvl>
+    <w:lvl w:ilvl="4" w:tplc="040C0003" w:tentative="1">
+      <w:start w:val="1"/>
+      <w:numFmt w:val="bullet"/>
+      <w:lvlText w:val="o"/>
+      <w:lvlJc w:val="left"/>
+      <w:pPr>
+        <w:ind w:left="3600" w:hanging="360"/>
+      </w:pPr>
+      <w:rPr>
+        <w:rFonts w:ascii="Courier New" w:hAnsi="Courier New" w:cs="Courier New" w:hint="default"/>
+      </w:rPr>
+    </w:lvl>
+    <w:lvl w:ilvl="5" w:tplc="040C0005" w:tentative="1">
+      <w:start w:val="1"/>
+      <w:numFmt w:val="bullet"/>
+      <w:lvlText w:val=""/>
+      <w:lvlJc w:val="left"/>
+      <w:pPr>
+        <w:ind w:left="4320" w:hanging="360"/>
+      </w:pPr>
+      <w:rPr>
+        <w:rFonts w:ascii="Wingdings" w:hAnsi="Wingdings" w:hint="default"/>
+      </w:rPr>
+    </w:lvl>
+    <w:lvl w:ilvl="6" w:tplc="040C0001" w:tentative="1">
+      <w:start w:val="1"/>
+      <w:numFmt w:val="bullet"/>
+      <w:lvlText w:val=""/>
+      <w:lvlJc w:val="left"/>
+      <w:pPr>
+        <w:ind w:left="5040" w:hanging="360"/>
+      </w:pPr>
+      <w:rPr>
+        <w:rFonts w:ascii="Symbol" w:hAnsi="Symbol" w:hint="default"/>
+      </w:rPr>
+    </w:lvl>
+    <w:lvl w:ilvl="7" w:tplc="040C0003" w:tentative="1">
+      <w:start w:val="1"/>
+      <w:numFmt w:val="bullet"/>
+      <w:lvlText w:val="o"/>
+      <w:lvlJc w:val="left"/>
+      <w:pPr>
+        <w:ind w:left="5760" w:hanging="360"/>
+      </w:pPr>
+      <w:rPr>
+        <w:rFonts w:ascii="Courier New" w:hAnsi="Courier New" w:cs="Courier New" w:hint="default"/>
+      </w:rPr>
+    </w:lvl>
+    <w:lvl w:ilvl="8" w:tplc="040C0005" w:tentative="1">
+      <w:start w:val="1"/>
+      <w:numFmt w:val="bullet"/>
+      <w:lvlText w:val=""/>
+      <w:lvlJc w:val="left"/>
+      <w:pPr>
+        <w:ind w:left="6480" w:hanging="360"/>
+      </w:pPr>
+      <w:rPr>
+        <w:rFonts w:ascii="Wingdings" w:hAnsi="Wingdings" w:hint="default"/>
+      </w:rPr>
+    </w:lvl>
+  </w:abstractNum>
+  <w:abstractNum w:abstractNumId="10" w15:restartNumberingAfterBreak="0">
     <w:nsid w:val="141779FB"/>
     <w:multiLevelType w:val="hybridMultilevel"/>
     <w:tmpl w:val="A7A61B66"/>
@@ -2366,7 +3879,7 @@
       </w:rPr>
     </w:lvl>
   </w:abstractNum>
-  <w:abstractNum w:abstractNumId="10" w15:restartNumberingAfterBreak="0">
+  <w:abstractNum w:abstractNumId="11" w15:restartNumberingAfterBreak="0">
     <w:nsid w:val="1B036878"/>
     <w:multiLevelType w:val="hybridMultilevel"/>
     <w:tmpl w:val="370AD622"/>
@@ -2479,7 +3992,120 @@
       </w:rPr>
     </w:lvl>
   </w:abstractNum>
-  <w:abstractNum w:abstractNumId="11" w15:restartNumberingAfterBreak="0">
+  <w:abstractNum w:abstractNumId="12" w15:restartNumberingAfterBreak="0">
+    <w:nsid w:val="24B208D2"/>
+    <w:multiLevelType w:val="hybridMultilevel"/>
+    <w:tmpl w:val="D88E6E84"/>
+    <w:lvl w:ilvl="0" w:tplc="040C0001">
+      <w:start w:val="1"/>
+      <w:numFmt w:val="bullet"/>
+      <w:lvlText w:val=""/>
+      <w:lvlJc w:val="left"/>
+      <w:pPr>
+        <w:ind w:left="720" w:hanging="360"/>
+      </w:pPr>
+      <w:rPr>
+        <w:rFonts w:ascii="Symbol" w:hAnsi="Symbol" w:hint="default"/>
+      </w:rPr>
+    </w:lvl>
+    <w:lvl w:ilvl="1" w:tplc="040C0003" w:tentative="1">
+      <w:start w:val="1"/>
+      <w:numFmt w:val="bullet"/>
+      <w:lvlText w:val="o"/>
+      <w:lvlJc w:val="left"/>
+      <w:pPr>
+        <w:ind w:left="1440" w:hanging="360"/>
+      </w:pPr>
+      <w:rPr>
+        <w:rFonts w:ascii="Courier New" w:hAnsi="Courier New" w:cs="Courier New" w:hint="default"/>
+      </w:rPr>
+    </w:lvl>
+    <w:lvl w:ilvl="2" w:tplc="040C0005" w:tentative="1">
+      <w:start w:val="1"/>
+      <w:numFmt w:val="bullet"/>
+      <w:lvlText w:val=""/>
+      <w:lvlJc w:val="left"/>
+      <w:pPr>
+        <w:ind w:left="2160" w:hanging="360"/>
+      </w:pPr>
+      <w:rPr>
+        <w:rFonts w:ascii="Wingdings" w:hAnsi="Wingdings" w:hint="default"/>
+      </w:rPr>
+    </w:lvl>
+    <w:lvl w:ilvl="3" w:tplc="040C0001" w:tentative="1">
+      <w:start w:val="1"/>
+      <w:numFmt w:val="bullet"/>
+      <w:lvlText w:val=""/>
+      <w:lvlJc w:val="left"/>
+      <w:pPr>
+        <w:ind w:left="2880" w:hanging="360"/>
+      </w:pPr>
+      <w:rPr>
+        <w:rFonts w:ascii="Symbol" w:hAnsi="Symbol" w:hint="default"/>
+      </w:rPr>
+    </w:lvl>
+    <w:lvl w:ilvl="4" w:tplc="040C0003" w:tentative="1">
+      <w:start w:val="1"/>
+      <w:numFmt w:val="bullet"/>
+      <w:lvlText w:val="o"/>
+      <w:lvlJc w:val="left"/>
+      <w:pPr>
+        <w:ind w:left="3600" w:hanging="360"/>
+      </w:pPr>
+      <w:rPr>
+        <w:rFonts w:ascii="Courier New" w:hAnsi="Courier New" w:cs="Courier New" w:hint="default"/>
+      </w:rPr>
+    </w:lvl>
+    <w:lvl w:ilvl="5" w:tplc="040C0005" w:tentative="1">
+      <w:start w:val="1"/>
+      <w:numFmt w:val="bullet"/>
+      <w:lvlText w:val=""/>
+      <w:lvlJc w:val="left"/>
+      <w:pPr>
+        <w:ind w:left="4320" w:hanging="360"/>
+      </w:pPr>
+      <w:rPr>
+        <w:rFonts w:ascii="Wingdings" w:hAnsi="Wingdings" w:hint="default"/>
+      </w:rPr>
+    </w:lvl>
+    <w:lvl w:ilvl="6" w:tplc="040C0001" w:tentative="1">
+      <w:start w:val="1"/>
+      <w:numFmt w:val="bullet"/>
+      <w:lvlText w:val=""/>
+      <w:lvlJc w:val="left"/>
+      <w:pPr>
+        <w:ind w:left="5040" w:hanging="360"/>
+      </w:pPr>
+      <w:rPr>
+        <w:rFonts w:ascii="Symbol" w:hAnsi="Symbol" w:hint="default"/>
+      </w:rPr>
+    </w:lvl>
+    <w:lvl w:ilvl="7" w:tplc="040C0003" w:tentative="1">
+      <w:start w:val="1"/>
+      <w:numFmt w:val="bullet"/>
+      <w:lvlText w:val="o"/>
+      <w:lvlJc w:val="left"/>
+      <w:pPr>
+        <w:ind w:left="5760" w:hanging="360"/>
+      </w:pPr>
+      <w:rPr>
+        <w:rFonts w:ascii="Courier New" w:hAnsi="Courier New" w:cs="Courier New" w:hint="default"/>
+      </w:rPr>
+    </w:lvl>
+    <w:lvl w:ilvl="8" w:tplc="040C0005" w:tentative="1">
+      <w:start w:val="1"/>
+      <w:numFmt w:val="bullet"/>
+      <w:lvlText w:val=""/>
+      <w:lvlJc w:val="left"/>
+      <w:pPr>
+        <w:ind w:left="6480" w:hanging="360"/>
+      </w:pPr>
+      <w:rPr>
+        <w:rFonts w:ascii="Wingdings" w:hAnsi="Wingdings" w:hint="default"/>
+      </w:rPr>
+    </w:lvl>
+  </w:abstractNum>
+  <w:abstractNum w:abstractNumId="13" w15:restartNumberingAfterBreak="0">
     <w:nsid w:val="393154C6"/>
     <w:multiLevelType w:val="hybridMultilevel"/>
     <w:tmpl w:val="B8AC240E"/>
@@ -2592,7 +4218,120 @@
       </w:rPr>
     </w:lvl>
   </w:abstractNum>
-  <w:abstractNum w:abstractNumId="12" w15:restartNumberingAfterBreak="0">
+  <w:abstractNum w:abstractNumId="14" w15:restartNumberingAfterBreak="0">
+    <w:nsid w:val="4BA41215"/>
+    <w:multiLevelType w:val="hybridMultilevel"/>
+    <w:tmpl w:val="7E8C1EA2"/>
+    <w:lvl w:ilvl="0" w:tplc="040C0001">
+      <w:start w:val="1"/>
+      <w:numFmt w:val="bullet"/>
+      <w:lvlText w:val=""/>
+      <w:lvlJc w:val="left"/>
+      <w:pPr>
+        <w:ind w:left="720" w:hanging="360"/>
+      </w:pPr>
+      <w:rPr>
+        <w:rFonts w:ascii="Symbol" w:hAnsi="Symbol" w:hint="default"/>
+      </w:rPr>
+    </w:lvl>
+    <w:lvl w:ilvl="1" w:tplc="040C0003" w:tentative="1">
+      <w:start w:val="1"/>
+      <w:numFmt w:val="bullet"/>
+      <w:lvlText w:val="o"/>
+      <w:lvlJc w:val="left"/>
+      <w:pPr>
+        <w:ind w:left="1440" w:hanging="360"/>
+      </w:pPr>
+      <w:rPr>
+        <w:rFonts w:ascii="Courier New" w:hAnsi="Courier New" w:cs="Courier New" w:hint="default"/>
+      </w:rPr>
+    </w:lvl>
+    <w:lvl w:ilvl="2" w:tplc="040C0005" w:tentative="1">
+      <w:start w:val="1"/>
+      <w:numFmt w:val="bullet"/>
+      <w:lvlText w:val=""/>
+      <w:lvlJc w:val="left"/>
+      <w:pPr>
+        <w:ind w:left="2160" w:hanging="360"/>
+      </w:pPr>
+      <w:rPr>
+        <w:rFonts w:ascii="Wingdings" w:hAnsi="Wingdings" w:hint="default"/>
+      </w:rPr>
+    </w:lvl>
+    <w:lvl w:ilvl="3" w:tplc="040C0001" w:tentative="1">
+      <w:start w:val="1"/>
+      <w:numFmt w:val="bullet"/>
+      <w:lvlText w:val=""/>
+      <w:lvlJc w:val="left"/>
+      <w:pPr>
+        <w:ind w:left="2880" w:hanging="360"/>
+      </w:pPr>
+      <w:rPr>
+        <w:rFonts w:ascii="Symbol" w:hAnsi="Symbol" w:hint="default"/>
+      </w:rPr>
+    </w:lvl>
+    <w:lvl w:ilvl="4" w:tplc="040C0003" w:tentative="1">
+      <w:start w:val="1"/>
+      <w:numFmt w:val="bullet"/>
+      <w:lvlText w:val="o"/>
+      <w:lvlJc w:val="left"/>
+      <w:pPr>
+        <w:ind w:left="3600" w:hanging="360"/>
+      </w:pPr>
+      <w:rPr>
+        <w:rFonts w:ascii="Courier New" w:hAnsi="Courier New" w:cs="Courier New" w:hint="default"/>
+      </w:rPr>
+    </w:lvl>
+    <w:lvl w:ilvl="5" w:tplc="040C0005" w:tentative="1">
+      <w:start w:val="1"/>
+      <w:numFmt w:val="bullet"/>
+      <w:lvlText w:val=""/>
+      <w:lvlJc w:val="left"/>
+      <w:pPr>
+        <w:ind w:left="4320" w:hanging="360"/>
+      </w:pPr>
+      <w:rPr>
+        <w:rFonts w:ascii="Wingdings" w:hAnsi="Wingdings" w:hint="default"/>
+      </w:rPr>
+    </w:lvl>
+    <w:lvl w:ilvl="6" w:tplc="040C0001" w:tentative="1">
+      <w:start w:val="1"/>
+      <w:numFmt w:val="bullet"/>
+      <w:lvlText w:val=""/>
+      <w:lvlJc w:val="left"/>
+      <w:pPr>
+        <w:ind w:left="5040" w:hanging="360"/>
+      </w:pPr>
+      <w:rPr>
+        <w:rFonts w:ascii="Symbol" w:hAnsi="Symbol" w:hint="default"/>
+      </w:rPr>
+    </w:lvl>
+    <w:lvl w:ilvl="7" w:tplc="040C0003" w:tentative="1">
+      <w:start w:val="1"/>
+      <w:numFmt w:val="bullet"/>
+      <w:lvlText w:val="o"/>
+      <w:lvlJc w:val="left"/>
+      <w:pPr>
+        <w:ind w:left="5760" w:hanging="360"/>
+      </w:pPr>
+      <w:rPr>
+        <w:rFonts w:ascii="Courier New" w:hAnsi="Courier New" w:cs="Courier New" w:hint="default"/>
+      </w:rPr>
+    </w:lvl>
+    <w:lvl w:ilvl="8" w:tplc="040C0005" w:tentative="1">
+      <w:start w:val="1"/>
+      <w:numFmt w:val="bullet"/>
+      <w:lvlText w:val=""/>
+      <w:lvlJc w:val="left"/>
+      <w:pPr>
+        <w:ind w:left="6480" w:hanging="360"/>
+      </w:pPr>
+      <w:rPr>
+        <w:rFonts w:ascii="Wingdings" w:hAnsi="Wingdings" w:hint="default"/>
+      </w:rPr>
+    </w:lvl>
+  </w:abstractNum>
+  <w:abstractNum w:abstractNumId="15" w15:restartNumberingAfterBreak="0">
     <w:nsid w:val="4E3C1746"/>
     <w:multiLevelType w:val="hybridMultilevel"/>
     <w:tmpl w:val="FB8E389E"/>
@@ -2705,7 +4444,7 @@
       </w:rPr>
     </w:lvl>
   </w:abstractNum>
-  <w:abstractNum w:abstractNumId="13" w15:restartNumberingAfterBreak="0">
+  <w:abstractNum w:abstractNumId="16" w15:restartNumberingAfterBreak="0">
     <w:nsid w:val="52B36492"/>
     <w:multiLevelType w:val="hybridMultilevel"/>
     <w:tmpl w:val="915A9FE8"/>
@@ -2818,7 +4557,7 @@
       </w:rPr>
     </w:lvl>
   </w:abstractNum>
-  <w:abstractNum w:abstractNumId="14" w15:restartNumberingAfterBreak="0">
+  <w:abstractNum w:abstractNumId="17" w15:restartNumberingAfterBreak="0">
     <w:nsid w:val="71F233DA"/>
     <w:multiLevelType w:val="hybridMultilevel"/>
     <w:tmpl w:val="DB14312E"/>
@@ -2931,7 +4670,7 @@
       </w:rPr>
     </w:lvl>
   </w:abstractNum>
-  <w:abstractNum w:abstractNumId="15" w15:restartNumberingAfterBreak="0">
+  <w:abstractNum w:abstractNumId="18" w15:restartNumberingAfterBreak="0">
     <w:nsid w:val="73DF703C"/>
     <w:multiLevelType w:val="hybridMultilevel"/>
     <w:tmpl w:val="AB46384C"/>
@@ -3044,7 +4783,120 @@
       </w:rPr>
     </w:lvl>
   </w:abstractNum>
-  <w:abstractNum w:abstractNumId="16" w15:restartNumberingAfterBreak="0">
+  <w:abstractNum w:abstractNumId="19" w15:restartNumberingAfterBreak="0">
+    <w:nsid w:val="7B734262"/>
+    <w:multiLevelType w:val="hybridMultilevel"/>
+    <w:tmpl w:val="0D2A7566"/>
+    <w:lvl w:ilvl="0" w:tplc="040C0001">
+      <w:start w:val="1"/>
+      <w:numFmt w:val="bullet"/>
+      <w:lvlText w:val=""/>
+      <w:lvlJc w:val="left"/>
+      <w:pPr>
+        <w:ind w:left="720" w:hanging="360"/>
+      </w:pPr>
+      <w:rPr>
+        <w:rFonts w:ascii="Symbol" w:hAnsi="Symbol" w:hint="default"/>
+      </w:rPr>
+    </w:lvl>
+    <w:lvl w:ilvl="1" w:tplc="040C0003" w:tentative="1">
+      <w:start w:val="1"/>
+      <w:numFmt w:val="bullet"/>
+      <w:lvlText w:val="o"/>
+      <w:lvlJc w:val="left"/>
+      <w:pPr>
+        <w:ind w:left="1440" w:hanging="360"/>
+      </w:pPr>
+      <w:rPr>
+        <w:rFonts w:ascii="Courier New" w:hAnsi="Courier New" w:cs="Courier New" w:hint="default"/>
+      </w:rPr>
+    </w:lvl>
+    <w:lvl w:ilvl="2" w:tplc="040C0005" w:tentative="1">
+      <w:start w:val="1"/>
+      <w:numFmt w:val="bullet"/>
+      <w:lvlText w:val=""/>
+      <w:lvlJc w:val="left"/>
+      <w:pPr>
+        <w:ind w:left="2160" w:hanging="360"/>
+      </w:pPr>
+      <w:rPr>
+        <w:rFonts w:ascii="Wingdings" w:hAnsi="Wingdings" w:hint="default"/>
+      </w:rPr>
+    </w:lvl>
+    <w:lvl w:ilvl="3" w:tplc="040C0001" w:tentative="1">
+      <w:start w:val="1"/>
+      <w:numFmt w:val="bullet"/>
+      <w:lvlText w:val=""/>
+      <w:lvlJc w:val="left"/>
+      <w:pPr>
+        <w:ind w:left="2880" w:hanging="360"/>
+      </w:pPr>
+      <w:rPr>
+        <w:rFonts w:ascii="Symbol" w:hAnsi="Symbol" w:hint="default"/>
+      </w:rPr>
+    </w:lvl>
+    <w:lvl w:ilvl="4" w:tplc="040C0003" w:tentative="1">
+      <w:start w:val="1"/>
+      <w:numFmt w:val="bullet"/>
+      <w:lvlText w:val="o"/>
+      <w:lvlJc w:val="left"/>
+      <w:pPr>
+        <w:ind w:left="3600" w:hanging="360"/>
+      </w:pPr>
+      <w:rPr>
+        <w:rFonts w:ascii="Courier New" w:hAnsi="Courier New" w:cs="Courier New" w:hint="default"/>
+      </w:rPr>
+    </w:lvl>
+    <w:lvl w:ilvl="5" w:tplc="040C0005" w:tentative="1">
+      <w:start w:val="1"/>
+      <w:numFmt w:val="bullet"/>
+      <w:lvlText w:val=""/>
+      <w:lvlJc w:val="left"/>
+      <w:pPr>
+        <w:ind w:left="4320" w:hanging="360"/>
+      </w:pPr>
+      <w:rPr>
+        <w:rFonts w:ascii="Wingdings" w:hAnsi="Wingdings" w:hint="default"/>
+      </w:rPr>
+    </w:lvl>
+    <w:lvl w:ilvl="6" w:tplc="040C0001" w:tentative="1">
+      <w:start w:val="1"/>
+      <w:numFmt w:val="bullet"/>
+      <w:lvlText w:val=""/>
+      <w:lvlJc w:val="left"/>
+      <w:pPr>
+        <w:ind w:left="5040" w:hanging="360"/>
+      </w:pPr>
+      <w:rPr>
+        <w:rFonts w:ascii="Symbol" w:hAnsi="Symbol" w:hint="default"/>
+      </w:rPr>
+    </w:lvl>
+    <w:lvl w:ilvl="7" w:tplc="040C0003" w:tentative="1">
+      <w:start w:val="1"/>
+      <w:numFmt w:val="bullet"/>
+      <w:lvlText w:val="o"/>
+      <w:lvlJc w:val="left"/>
+      <w:pPr>
+        <w:ind w:left="5760" w:hanging="360"/>
+      </w:pPr>
+      <w:rPr>
+        <w:rFonts w:ascii="Courier New" w:hAnsi="Courier New" w:cs="Courier New" w:hint="default"/>
+      </w:rPr>
+    </w:lvl>
+    <w:lvl w:ilvl="8" w:tplc="040C0005" w:tentative="1">
+      <w:start w:val="1"/>
+      <w:numFmt w:val="bullet"/>
+      <w:lvlText w:val=""/>
+      <w:lvlJc w:val="left"/>
+      <w:pPr>
+        <w:ind w:left="6480" w:hanging="360"/>
+      </w:pPr>
+      <w:rPr>
+        <w:rFonts w:ascii="Wingdings" w:hAnsi="Wingdings" w:hint="default"/>
+      </w:rPr>
+    </w:lvl>
+  </w:abstractNum>
+  <w:abstractNum w:abstractNumId="20" w15:restartNumberingAfterBreak="0">
     <w:nsid w:val="7D841647"/>
     <w:multiLevelType w:val="hybridMultilevel"/>
     <w:tmpl w:val="B4B056EE"/>
@@ -3157,7 +5009,7 @@
       </w:rPr>
     </w:lvl>
   </w:abstractNum>
-  <w:abstractNum w:abstractNumId="17" w15:restartNumberingAfterBreak="0">
+  <w:abstractNum w:abstractNumId="21" w15:restartNumberingAfterBreak="0">
     <w:nsid w:val="7E02549F"/>
     <w:multiLevelType w:val="hybridMultilevel"/>
     <w:tmpl w:val="07301D96"/>
@@ -3298,31 +5150,43 @@
     <w:abstractNumId w:val="0"/>
   </w:num>
   <w:num w:numId="10" w16cid:durableId="761872506">
+    <w:abstractNumId w:val="16"/>
+  </w:num>
+  <w:num w:numId="11" w16cid:durableId="872116144">
+    <w:abstractNumId w:val="17"/>
+  </w:num>
+  <w:num w:numId="12" w16cid:durableId="1412459432">
+    <w:abstractNumId w:val="15"/>
+  </w:num>
+  <w:num w:numId="13" w16cid:durableId="986662102">
+    <w:abstractNumId w:val="21"/>
+  </w:num>
+  <w:num w:numId="14" w16cid:durableId="403112866">
+    <w:abstractNumId w:val="11"/>
+  </w:num>
+  <w:num w:numId="15" w16cid:durableId="1786851155">
+    <w:abstractNumId w:val="10"/>
+  </w:num>
+  <w:num w:numId="16" w16cid:durableId="1637562467">
+    <w:abstractNumId w:val="20"/>
+  </w:num>
+  <w:num w:numId="17" w16cid:durableId="761339887">
     <w:abstractNumId w:val="13"/>
   </w:num>
-  <w:num w:numId="11" w16cid:durableId="872116144">
+  <w:num w:numId="18" w16cid:durableId="784621870">
+    <w:abstractNumId w:val="18"/>
+  </w:num>
+  <w:num w:numId="19" w16cid:durableId="1739550757">
+    <w:abstractNumId w:val="9"/>
+  </w:num>
+  <w:num w:numId="20" w16cid:durableId="1876309726">
+    <w:abstractNumId w:val="12"/>
+  </w:num>
+  <w:num w:numId="21" w16cid:durableId="761804097">
     <w:abstractNumId w:val="14"/>
   </w:num>
-  <w:num w:numId="12" w16cid:durableId="1412459432">
-    <w:abstractNumId w:val="12"/>
-  </w:num>
-  <w:num w:numId="13" w16cid:durableId="986662102">
-    <w:abstractNumId w:val="17"/>
-  </w:num>
-  <w:num w:numId="14" w16cid:durableId="403112866">
-    <w:abstractNumId w:val="10"/>
-  </w:num>
-  <w:num w:numId="15" w16cid:durableId="1786851155">
-    <w:abstractNumId w:val="9"/>
-  </w:num>
-  <w:num w:numId="16" w16cid:durableId="1637562467">
-    <w:abstractNumId w:val="16"/>
-  </w:num>
-  <w:num w:numId="17" w16cid:durableId="761339887">
-    <w:abstractNumId w:val="11"/>
-  </w:num>
-  <w:num w:numId="18" w16cid:durableId="784621870">
-    <w:abstractNumId w:val="15"/>
+  <w:num w:numId="22" w16cid:durableId="1676035973">
+    <w:abstractNumId w:val="19"/>
   </w:num>
 </w:numbering>
 </file>
@@ -3934,7 +5798,6 @@
   <w:style w:type="character" w:default="1" w:styleId="Policepardfaut">
     <w:name w:val="Default Paragraph Font"/>
     <w:uiPriority w:val="1"/>
-    <w:semiHidden/>
     <w:unhideWhenUsed/>
   </w:style>
   <w:style w:type="table" w:default="1" w:styleId="TableauNormal">
@@ -14711,6 +16574,42 @@
       </w:tcPr>
     </w:tblStylePr>
   </w:style>
+  <w:style w:type="character" w:styleId="Lienhypertexte">
+    <w:name w:val="Hyperlink"/>
+    <w:basedOn w:val="Policepardfaut"/>
+    <w:uiPriority w:val="99"/>
+    <w:unhideWhenUsed/>
+    <w:rsid w:val="00293CA8"/>
+    <w:rPr>
+      <w:color w:val="0000FF" w:themeColor="hyperlink"/>
+      <w:u w:val="single"/>
+    </w:rPr>
+  </w:style>
+  <w:style w:type="character" w:styleId="Mentionnonrsolue">
+    <w:name w:val="Unresolved Mention"/>
+    <w:basedOn w:val="Policepardfaut"/>
+    <w:uiPriority w:val="99"/>
+    <w:semiHidden/>
+    <w:unhideWhenUsed/>
+    <w:rsid w:val="00293CA8"/>
+    <w:rPr>
+      <w:color w:val="605E5C"/>
+      <w:shd w:val="clear" w:color="auto" w:fill="E1DFDD"/>
+    </w:rPr>
+  </w:style>
+  <w:style w:type="paragraph" w:styleId="NormalWeb">
+    <w:name w:val="Normal (Web)"/>
+    <w:basedOn w:val="Normal"/>
+    <w:uiPriority w:val="99"/>
+    <w:semiHidden/>
+    <w:unhideWhenUsed/>
+    <w:rsid w:val="00775D81"/>
+    <w:rPr>
+      <w:rFonts w:ascii="Times New Roman" w:hAnsi="Times New Roman" w:cs="Times New Roman"/>
+      <w:sz w:val="24"/>
+      <w:szCs w:val="24"/>
+    </w:rPr>
+  </w:style>
 </w:styles>
 </file>
 

</xml_diff>